<commit_message>
docs: incrustar figuras cientificas y diagramas en informe tecnico docx
</commit_message>
<xml_diff>
--- a/docs/INFORME_TECNICO_FINAL.docx
+++ b/docs/INFORME_TECNICO_FINAL.docx
@@ -2524,6 +2524,60 @@
     </w:p>
     <w:p>
       <w:pPr>
+        <w:spacing w:before="200" w:after="40"/>
+        <w:jc w:val="center"/>
+      </w:pPr>
+      <w:r>
+        <w:drawing>
+          <wp:inline xmlns:a="http://schemas.openxmlformats.org/drawingml/2006/main" xmlns:pic="http://schemas.openxmlformats.org/drawingml/2006/picture">
+            <wp:extent cx="5486400" cy="2110154"/>
+            <wp:docPr id="1" name="Picture 1"/>
+            <wp:cNvGraphicFramePr>
+              <a:graphicFrameLocks noChangeAspect="1"/>
+            </wp:cNvGraphicFramePr>
+            <a:graphic>
+              <a:graphicData uri="http://schemas.openxmlformats.org/drawingml/2006/picture">
+                <pic:pic>
+                  <pic:nvPicPr>
+                    <pic:cNvPr id="0" name="distribucion_streams.png"/>
+                    <pic:cNvPicPr/>
+                  </pic:nvPicPr>
+                  <pic:blipFill>
+                    <a:blip r:embed="rId9"/>
+                    <a:stretch>
+                      <a:fillRect/>
+                    </a:stretch>
+                  </pic:blipFill>
+                  <pic:spPr>
+                    <a:xfrm>
+                      <a:off x="0" y="0"/>
+                      <a:ext cx="5486400" cy="2110154"/>
+                    </a:xfrm>
+                    <a:prstGeom prst="rect"/>
+                  </pic:spPr>
+                </pic:pic>
+              </a:graphicData>
+            </a:graphic>
+          </wp:inline>
+        </w:drawing>
+      </w:r>
+    </w:p>
+    <w:p>
+      <w:pPr>
+        <w:spacing w:before="40" w:after="240"/>
+        <w:jc w:val="center"/>
+      </w:pPr>
+      <w:r>
+        <w:rPr>
+          <w:i/>
+          <w:color w:val="475569"/>
+          <w:sz w:val="17"/>
+        </w:rPr>
+        <w:t>Figura 1: Distribución Asimétrica de Reproducciones y Espacio Acústico (Bailabilidad vs. Energía)</w:t>
+      </w:r>
+    </w:p>
+    <w:p>
+      <w:pPr>
         <w:pStyle w:val="Heading1"/>
         <w:keepNext/>
         <w:spacing w:before="320" w:after="120"/>
@@ -3579,6 +3633,60 @@
     </w:p>
     <w:p>
       <w:pPr>
+        <w:spacing w:before="200" w:after="40"/>
+        <w:jc w:val="center"/>
+      </w:pPr>
+      <w:r>
+        <w:drawing>
+          <wp:inline xmlns:a="http://schemas.openxmlformats.org/drawingml/2006/main" xmlns:pic="http://schemas.openxmlformats.org/drawingml/2006/picture">
+            <wp:extent cx="5486400" cy="2110154"/>
+            <wp:docPr id="2" name="Picture 2"/>
+            <wp:cNvGraphicFramePr>
+              <a:graphicFrameLocks noChangeAspect="1"/>
+            </wp:cNvGraphicFramePr>
+            <a:graphic>
+              <a:graphicData uri="http://schemas.openxmlformats.org/drawingml/2006/picture">
+                <pic:pic>
+                  <pic:nvPicPr>
+                    <pic:cNvPr id="0" name="metodo_codo_silueta.png"/>
+                    <pic:cNvPicPr/>
+                  </pic:nvPicPr>
+                  <pic:blipFill>
+                    <a:blip r:embed="rId10"/>
+                    <a:stretch>
+                      <a:fillRect/>
+                    </a:stretch>
+                  </pic:blipFill>
+                  <pic:spPr>
+                    <a:xfrm>
+                      <a:off x="0" y="0"/>
+                      <a:ext cx="5486400" cy="2110154"/>
+                    </a:xfrm>
+                    <a:prstGeom prst="rect"/>
+                  </pic:spPr>
+                </pic:pic>
+              </a:graphicData>
+            </a:graphic>
+          </wp:inline>
+        </w:drawing>
+      </w:r>
+    </w:p>
+    <w:p>
+      <w:pPr>
+        <w:spacing w:before="40" w:after="240"/>
+        <w:jc w:val="center"/>
+      </w:pPr>
+      <w:r>
+        <w:rPr>
+          <w:i/>
+          <w:color w:val="475569"/>
+          <w:sz w:val="17"/>
+        </w:rPr>
+        <w:t>Figura 2: Justificación Cuantitativa de K=4 mediante Método del Codo e Índice de Silueta</w:t>
+      </w:r>
+    </w:p>
+    <w:p>
+      <w:pPr>
         <w:pStyle w:val="Heading3"/>
         <w:keepNext/>
         <w:spacing w:before="160" w:after="40"/>
@@ -3841,6 +3949,60 @@
           <w:sz w:val="20"/>
         </w:rPr>
         <w:t>3. Desempeño balanceado y libre de memorización sobre datos nunca antes vistos.</w:t>
+      </w:r>
+    </w:p>
+    <w:p>
+      <w:pPr>
+        <w:spacing w:before="200" w:after="40"/>
+        <w:jc w:val="center"/>
+      </w:pPr>
+      <w:r>
+        <w:drawing>
+          <wp:inline xmlns:a="http://schemas.openxmlformats.org/drawingml/2006/main" xmlns:pic="http://schemas.openxmlformats.org/drawingml/2006/picture">
+            <wp:extent cx="5760720" cy="2880360"/>
+            <wp:docPr id="3" name="Picture 3"/>
+            <wp:cNvGraphicFramePr>
+              <a:graphicFrameLocks noChangeAspect="1"/>
+            </wp:cNvGraphicFramePr>
+            <a:graphic>
+              <a:graphicData uri="http://schemas.openxmlformats.org/drawingml/2006/picture">
+                <pic:pic>
+                  <pic:nvPicPr>
+                    <pic:cNvPr id="0" name="arbol_decision_grafico.png"/>
+                    <pic:cNvPicPr/>
+                  </pic:nvPicPr>
+                  <pic:blipFill>
+                    <a:blip r:embed="rId11"/>
+                    <a:stretch>
+                      <a:fillRect/>
+                    </a:stretch>
+                  </pic:blipFill>
+                  <pic:spPr>
+                    <a:xfrm>
+                      <a:off x="0" y="0"/>
+                      <a:ext cx="5760720" cy="2880360"/>
+                    </a:xfrm>
+                    <a:prstGeom prst="rect"/>
+                  </pic:spPr>
+                </pic:pic>
+              </a:graphicData>
+            </a:graphic>
+          </wp:inline>
+        </w:drawing>
+      </w:r>
+    </w:p>
+    <w:p>
+      <w:pPr>
+        <w:spacing w:before="40" w:after="240"/>
+        <w:jc w:val="center"/>
+      </w:pPr>
+      <w:r>
+        <w:rPr>
+          <w:i/>
+          <w:color w:val="475569"/>
+          <w:sz w:val="17"/>
+        </w:rPr>
+        <w:t>Figura 3: Estructura Jerárquica del Árbol de Decisión Entrenado (Profundidad Máxima = 3)</w:t>
       </w:r>
     </w:p>
     <w:p>
@@ -4556,6 +4718,60 @@
     </w:p>
     <w:p>
       <w:pPr>
+        <w:spacing w:before="200" w:after="40"/>
+        <w:jc w:val="center"/>
+      </w:pPr>
+      <w:r>
+        <w:drawing>
+          <wp:inline xmlns:a="http://schemas.openxmlformats.org/drawingml/2006/main" xmlns:pic="http://schemas.openxmlformats.org/drawingml/2006/picture">
+            <wp:extent cx="3840480" cy="2954215"/>
+            <wp:docPr id="4" name="Picture 4"/>
+            <wp:cNvGraphicFramePr>
+              <a:graphicFrameLocks noChangeAspect="1"/>
+            </wp:cNvGraphicFramePr>
+            <a:graphic>
+              <a:graphicData uri="http://schemas.openxmlformats.org/drawingml/2006/picture">
+                <pic:pic>
+                  <pic:nvPicPr>
+                    <pic:cNvPr id="0" name="matriz_confusion.png"/>
+                    <pic:cNvPicPr/>
+                  </pic:nvPicPr>
+                  <pic:blipFill>
+                    <a:blip r:embed="rId12"/>
+                    <a:stretch>
+                      <a:fillRect/>
+                    </a:stretch>
+                  </pic:blipFill>
+                  <pic:spPr>
+                    <a:xfrm>
+                      <a:off x="0" y="0"/>
+                      <a:ext cx="3840480" cy="2954215"/>
+                    </a:xfrm>
+                    <a:prstGeom prst="rect"/>
+                  </pic:spPr>
+                </pic:pic>
+              </a:graphicData>
+            </a:graphic>
+          </wp:inline>
+        </w:drawing>
+      </w:r>
+    </w:p>
+    <w:p>
+      <w:pPr>
+        <w:spacing w:before="40" w:after="240"/>
+        <w:jc w:val="center"/>
+      </w:pPr>
+      <w:r>
+        <w:rPr>
+          <w:i/>
+          <w:color w:val="475569"/>
+          <w:sz w:val="17"/>
+        </w:rPr>
+        <w:t>Figura 4: Mapa de Calor de la Matriz de Confusión en Prueba Independiente</w:t>
+      </w:r>
+    </w:p>
+    <w:p>
+      <w:pPr>
         <w:pStyle w:val="Heading2"/>
         <w:keepNext/>
         <w:spacing w:before="240" w:after="80"/>
@@ -5246,6 +5462,60 @@
           <w:sz w:val="20"/>
         </w:rPr>
         <w:t>El sistema opera bajo un patrón cliente-servidor con arquitectura desacoplada:</w:t>
+      </w:r>
+    </w:p>
+    <w:p>
+      <w:pPr>
+        <w:spacing w:before="200" w:after="40"/>
+        <w:jc w:val="center"/>
+      </w:pPr>
+      <w:r>
+        <w:drawing>
+          <wp:inline xmlns:a="http://schemas.openxmlformats.org/drawingml/2006/main" xmlns:pic="http://schemas.openxmlformats.org/drawingml/2006/picture">
+            <wp:extent cx="5486400" cy="2743200"/>
+            <wp:docPr id="5" name="Picture 5"/>
+            <wp:cNvGraphicFramePr>
+              <a:graphicFrameLocks noChangeAspect="1"/>
+            </wp:cNvGraphicFramePr>
+            <a:graphic>
+              <a:graphicData uri="http://schemas.openxmlformats.org/drawingml/2006/picture">
+                <pic:pic>
+                  <pic:nvPicPr>
+                    <pic:cNvPr id="0" name="arquitectura_sistema.png"/>
+                    <pic:cNvPicPr/>
+                  </pic:nvPicPr>
+                  <pic:blipFill>
+                    <a:blip r:embed="rId13"/>
+                    <a:stretch>
+                      <a:fillRect/>
+                    </a:stretch>
+                  </pic:blipFill>
+                  <pic:spPr>
+                    <a:xfrm>
+                      <a:off x="0" y="0"/>
+                      <a:ext cx="5486400" cy="2743200"/>
+                    </a:xfrm>
+                    <a:prstGeom prst="rect"/>
+                  </pic:spPr>
+                </pic:pic>
+              </a:graphicData>
+            </a:graphic>
+          </wp:inline>
+        </w:drawing>
+      </w:r>
+    </w:p>
+    <w:p>
+      <w:pPr>
+        <w:spacing w:before="40" w:after="240"/>
+        <w:jc w:val="center"/>
+      </w:pPr>
+      <w:r>
+        <w:rPr>
+          <w:i/>
+          <w:color w:val="475569"/>
+          <w:sz w:val="17"/>
+        </w:rPr>
+        <w:t>Figura 5: Diagrama de Arquitectura de la Plataforma SoundData Analytics</w:t>
       </w:r>
     </w:p>
     <w:p>

</xml_diff>

<commit_message>
feat: generar dos presentaciones pptx (app web y proyecto crisp-dm) e incrustar capturas de app
</commit_message>
<xml_diff>
--- a/docs/INFORME_TECNICO_FINAL.docx
+++ b/docs/INFORME_TECNICO_FINAL.docx
@@ -650,7 +650,7 @@
     <w:p>
       <w:pPr>
         <w:pStyle w:val="ListBullet"/>
-        <w:spacing w:before="20" w:after="40"/>
+        <w:spacing w:before="30" w:after="50"/>
       </w:pPr>
       <w:r>
         <w:rPr>
@@ -661,7 +661,7 @@
       <w:r>
         <w:rPr>
           <w:b/>
-          <w:color w:val="1E293B"/>
+          <w:color w:val="0F172A"/>
           <w:sz w:val="20"/>
         </w:rPr>
         <w:t>Criterio Analítico:</w:t>
@@ -677,7 +677,7 @@
     <w:p>
       <w:pPr>
         <w:pStyle w:val="ListBullet"/>
-        <w:spacing w:before="20" w:after="40"/>
+        <w:spacing w:before="30" w:after="50"/>
       </w:pPr>
       <w:r>
         <w:rPr>
@@ -690,33 +690,33 @@
     <w:p>
       <w:pPr>
         <w:pStyle w:val="ListBullet"/>
-        <w:spacing w:before="20" w:after="40"/>
+        <w:spacing w:before="30" w:after="50"/>
       </w:pPr>
       <w:r>
         <w:rPr>
           <w:color w:val="1E293B"/>
           <w:sz w:val="20"/>
         </w:rPr>
-        <w:t>Agrupamiento K-Means con justificación matemática del número de grupos (K=4) mediante análisis de Inercia (Codo) y Coeficiente de Silueta.</w:t>
+        <w:t>Agrupamiento K-Means con justificación matemática del número de grupos (K = 4) mediante análisis de Inercia (Método del Codo) y Coeficiente de Silueta.</w:t>
       </w:r>
     </w:p>
     <w:p>
       <w:pPr>
         <w:pStyle w:val="ListBullet"/>
-        <w:spacing w:before="20" w:after="40"/>
+        <w:spacing w:before="30" w:after="50"/>
       </w:pPr>
       <w:r>
         <w:rPr>
           <w:color w:val="1E293B"/>
           <w:sz w:val="20"/>
         </w:rPr>
-        <w:t>Reglas de asociación con soporte mínimo de 1%, confianza superior al 50% y *Lift* superior a 3.0 para garantizar correlaciones no aleatorias.</w:t>
+        <w:t>Reglas de asociación con soporte mínimo de 1%, confianza superior al 50% y fuerza de asociación (Lift) superior a 3,0 para garantizar correlaciones no aleatorias.</w:t>
       </w:r>
     </w:p>
     <w:p>
       <w:pPr>
         <w:pStyle w:val="ListBullet"/>
-        <w:spacing w:before="20" w:after="40"/>
+        <w:spacing w:before="30" w:after="50"/>
       </w:pPr>
       <w:r>
         <w:rPr>
@@ -727,7 +727,7 @@
       <w:r>
         <w:rPr>
           <w:b/>
-          <w:color w:val="1E293B"/>
+          <w:color w:val="0F172A"/>
           <w:sz w:val="20"/>
         </w:rPr>
         <w:t>Criterio Tecnológico:</w:t>
@@ -743,7 +743,7 @@
     <w:p>
       <w:pPr>
         <w:pStyle w:val="ListBullet"/>
-        <w:spacing w:before="20" w:after="40"/>
+        <w:spacing w:before="30" w:after="50"/>
       </w:pPr>
       <w:r>
         <w:rPr>
@@ -754,7 +754,7 @@
       <w:r>
         <w:rPr>
           <w:b/>
-          <w:color w:val="1E293B"/>
+          <w:color w:val="0F172A"/>
           <w:sz w:val="20"/>
         </w:rPr>
         <w:t>Criterio de Usabilidad:</w:t>
@@ -2386,7 +2386,7 @@
                 <w:color w:val="1E293B"/>
                 <w:sz w:val="18"/>
               </w:rPr>
-              <w:t>1 si stream_count \ge Percentil 75 (~85.000.000 streams), 0 en caso contrario.</w:t>
+              <w:t>1 si las reproducciones superan el Percentil 75 (≥ 85.200.000 streams), 0 en caso contrario.</w:t>
             </w:r>
           </w:p>
         </w:tc>
@@ -2492,7 +2492,7 @@
           <w:color w:val="1E293B"/>
           <w:sz w:val="20"/>
         </w:rPr>
-        <w:t xml:space="preserve"> El número de reproducciones presenta una fuerte asimetría positiva (*right-skewed*), donde el 25% superior de canciones concentra más del 68% de las reproducciones totales de la plataforma. Por ello, se definió el percentil 75 (Q_3 \approx 85.200.000 reproducciones) como el umbral de corte para definir formalmente la clase objetivo es_exito.</w:t>
+        <w:t xml:space="preserve"> El número de reproducciones presenta una marcada asimetría positiva (*right-skewed*), donde el 25% superior de canciones concentra más del 68% de las reproducciones totales de la plataforma. Por ello, se definió el percentil 75 (Q₃ ≈ 85.200.000 reproducciones) como el umbral de corte para definir formalmente la clase objetivo es_exito.</w:t>
       </w:r>
     </w:p>
     <w:p>
@@ -2519,7 +2519,7 @@
           <w:color w:val="1E293B"/>
           <w:sz w:val="20"/>
         </w:rPr>
-        <w:t xml:space="preserve"> Existe una correlación positiva moderada entre energy y loudness (r = +0.72), mientras que instrumentalness exhibe correlación negativa con popularity (r = -0.34), reflejando que el público masivo prefiere temas con presencia vocal dominante.</w:t>
+        <w:t xml:space="preserve"> Existe una correlación positiva moderada entre la Energía y la Sonoridad (coeficiente r = +0,72), mientras que la Instrumentalidad exhibe correlación negativa con la Popularidad (coeficiente r = -0,34), reflejando que el público masivo prefiere temas con presencia vocal dominante.</w:t>
       </w:r>
     </w:p>
     <w:p>
@@ -2642,7 +2642,7 @@
           <w:color w:val="1E293B"/>
           <w:sz w:val="20"/>
         </w:rPr>
-        <w:t xml:space="preserve">Para salvaguardar los modelos basados en distancias (como K-Means) y escalamiento estadístico, se aplicó la técnica robusta de detección de valores atípicos mediante el </w:t>
+        <w:t xml:space="preserve">Para salvaguardar los modelos basados en distancias (como K-Means) y el escalamiento estadístico, se aplicó la técnica robusta de detección de valores atípicos mediante el </w:t>
       </w:r>
       <w:r>
         <w:rPr>
@@ -2650,7 +2650,7 @@
           <w:color w:val="1E293B"/>
           <w:sz w:val="20"/>
         </w:rPr>
-        <w:t>Rango Intercuartílico ($IQR = Q_3 - Q_1$)</w:t>
+        <w:t>Rango Intercuartílico (IQR = Q₃ - Q₁)</w:t>
       </w:r>
       <w:r>
         <w:rPr>
@@ -2662,32 +2662,62 @@
     </w:p>
     <w:p>
       <w:pPr>
-        <w:spacing w:before="60" w:after="80" w:line="276" w:lineRule="auto"/>
+        <w:pStyle w:val="ListBullet"/>
+        <w:spacing w:before="30" w:after="50"/>
       </w:pPr>
       <w:r>
         <w:rPr>
           <w:color w:val="1E293B"/>
           <w:sz w:val="20"/>
         </w:rPr>
-        <w:t>\text{Límite Inferior} = Q_1 - 1.5 \times IQR</w:t>
+      </w:r>
+      <w:r>
+        <w:rPr>
+          <w:b/>
+          <w:color w:val="0F172A"/>
+          <w:sz w:val="20"/>
+        </w:rPr>
+        <w:t>Rango Intercuartílico:</w:t>
+      </w:r>
+      <w:r>
+        <w:rPr>
+          <w:color w:val="1E293B"/>
+          <w:sz w:val="20"/>
+        </w:rPr>
+        <w:t xml:space="preserve"> IQR = Q₃ - Q₁</w:t>
       </w:r>
     </w:p>
     <w:p>
       <w:pPr>
-        <w:spacing w:before="60" w:after="80" w:line="276" w:lineRule="auto"/>
+        <w:pStyle w:val="ListBullet"/>
+        <w:spacing w:before="30" w:after="50"/>
       </w:pPr>
       <w:r>
         <w:rPr>
           <w:color w:val="1E293B"/>
           <w:sz w:val="20"/>
         </w:rPr>
-        <w:t>\text{Límite Superior} = Q_3 + 1.5 \times IQR</w:t>
+      </w:r>
+      <w:r>
+        <w:rPr>
+          <w:b/>
+          <w:color w:val="0F172A"/>
+          <w:sz w:val="20"/>
+        </w:rPr>
+        <w:t>Límite Inferior de Aceptación:</w:t>
+      </w:r>
+      <w:r>
+        <w:rPr>
+          <w:color w:val="1E293B"/>
+          <w:sz w:val="20"/>
+        </w:rPr>
+        <w:t xml:space="preserve"> Q₁ - (1,5 × IQR)</w:t>
       </w:r>
     </w:p>
     <w:p>
       <w:pPr>
         <w:pStyle w:val="ListBullet"/>
-        <w:spacing w:before="20" w:after="40"/>
+        <w:spacing w:before="30" w:after="50"/>
       </w:pPr>
       <w:r>
         <w:rPr>
@@ -2698,23 +2728,23 @@
       <w:r>
         <w:rPr>
           <w:b/>
+          <w:color w:val="0F172A"/>
+          <w:sz w:val="20"/>
+        </w:rPr>
+        <w:t>Límite Superior de Aceptación:</w:t>
+      </w:r>
+      <w:r>
+        <w:rPr>
           <w:color w:val="1E293B"/>
           <w:sz w:val="20"/>
         </w:rPr>
-        <w:t>En variables acústicas acotadas (`danceability`, `energy`, `tempo`):</w:t>
-      </w:r>
-      <w:r>
-        <w:rPr>
-          <w:color w:val="1E293B"/>
-          <w:sz w:val="20"/>
-        </w:rPr>
-        <w:t xml:space="preserve"> Los outliers detectados correspondían a temas experimentales (p. ej. BPM superior a 210 o tempo inferior a 55). Se aplicó una técnica de *capping* (winsorización) sobre los percentiles 1% y 99% para conservar la información sin distorsionar el cálculo de centroides.</w:t>
+        <w:t xml:space="preserve"> Q₃ + (1,5 × IQR)</w:t>
       </w:r>
     </w:p>
     <w:p>
       <w:pPr>
         <w:pStyle w:val="ListBullet"/>
-        <w:spacing w:before="20" w:after="40"/>
+        <w:spacing w:before="30" w:after="50"/>
       </w:pPr>
       <w:r>
         <w:rPr>
@@ -2725,17 +2755,44 @@
       <w:r>
         <w:rPr>
           <w:b/>
+          <w:color w:val="0F172A"/>
+          <w:sz w:val="20"/>
+        </w:rPr>
+        <w:t>En variables acústicas acotadas (Bailabilidad, Energía, Tempo):</w:t>
+      </w:r>
+      <w:r>
+        <w:rPr>
           <w:color w:val="1E293B"/>
           <w:sz w:val="20"/>
         </w:rPr>
-        <w:t>En la variable `stream_count`:</w:t>
-      </w:r>
+        <w:t xml:space="preserve"> Los valores atípicos detectados correspondían a temas experimentales (por ejemplo, BPM superior a 210 o tempo inferior a 55). Se aplicó una técnica de acotamiento o winsorización sobre los percentiles 1% y 99% para conservar la información sin distorsionar el cálculo de los centroides de los grupos.</w:t>
+      </w:r>
+    </w:p>
+    <w:p>
+      <w:pPr>
+        <w:pStyle w:val="ListBullet"/>
+        <w:spacing w:before="30" w:after="50"/>
+      </w:pPr>
       <w:r>
         <w:rPr>
           <w:color w:val="1E293B"/>
           <w:sz w:val="20"/>
         </w:rPr>
-        <w:t xml:space="preserve"> Aunque matemáticamente superan el umbral Q_3 + 1.5 \times IQR, no fueron eliminados dado que representan justamente los "Mega-Hits" de la industria musical, esenciales para el negocio.</w:t>
+      </w:r>
+      <w:r>
+        <w:rPr>
+          <w:b/>
+          <w:color w:val="0F172A"/>
+          <w:sz w:val="20"/>
+        </w:rPr>
+        <w:t>En la variable de reproducciones (Stream Count):</w:t>
+      </w:r>
+      <w:r>
+        <w:rPr>
+          <w:color w:val="1E293B"/>
+          <w:sz w:val="20"/>
+        </w:rPr>
+        <w:t xml:space="preserve"> Aunque matemáticamente superan el límite superior (Q₃ + 1,5 × IQR), no fueron eliminados dado que representan justamente los "Grandes Éxitos" (Mega-Hits) de la industria musical, esenciales para los objetivos del negocio.</w:t>
       </w:r>
     </w:p>
     <w:p>
@@ -2756,7 +2813,7 @@
     <w:p>
       <w:pPr>
         <w:pStyle w:val="ListBullet"/>
-        <w:spacing w:before="20" w:after="40"/>
+        <w:spacing w:before="30" w:after="50"/>
       </w:pPr>
       <w:r>
         <w:rPr>
@@ -2768,30 +2825,45 @@
       <w:r>
         <w:rPr>
           <w:b/>
+          <w:color w:val="0F172A"/>
+          <w:sz w:val="20"/>
+        </w:rPr>
+        <w:t>Apriori</w:t>
+      </w:r>
+      <w:r>
+        <w:rPr>
           <w:color w:val="1E293B"/>
           <w:sz w:val="20"/>
         </w:rPr>
-        <w:t>Apriori</w:t>
+        <w:t>, las variables categóricas (género musical, país y contenido explícito) y las variables numéricas continuas fueron binarizadas. Las variables continuas se discretizaron en percentiles (Alto Volumen de Streams, Alta Popularidad, Baja Bailabilidad, etc.) para conformar la matriz de transacciones de presencia/ausencia (</w:t>
+      </w:r>
+      <w:r>
+        <w:rPr>
+          <w:i/>
+          <w:color w:val="475569"/>
+          <w:sz w:val="19"/>
+        </w:rPr>
+        <w:t>One-Hot Representation</w:t>
       </w:r>
       <w:r>
         <w:rPr>
           <w:color w:val="1E293B"/>
           <w:sz w:val="20"/>
         </w:rPr>
-        <w:t>, las variables categóricas (genre, country, explicit) y las numéricas continuas fueron binarizadas. Las variables continuas se discretizaron en percentiles (Alto_Stream, Alta_Popularidad, Baja_Bailabilidad, etc.) para conformar la matriz de transacciones de presencia/ausencia (*One-Hot Representation*).</w:t>
+        <w:t>).</w:t>
       </w:r>
     </w:p>
     <w:p>
       <w:pPr>
         <w:pStyle w:val="ListBullet"/>
-        <w:spacing w:before="20" w:after="40"/>
+        <w:spacing w:before="30" w:after="50"/>
       </w:pPr>
       <w:r>
         <w:rPr>
           <w:color w:val="1E293B"/>
           <w:sz w:val="20"/>
         </w:rPr>
-        <w:t>Para el Árbol de Decisión y K-Means, se utilizó la variable explicit como booleano numérico (0 y 1).</w:t>
+        <w:t>Para el Árbol de Decisión y K-Means, se utilizó la variable explicit como valor booleano numérico (0 para No Explícito, 1 para Explícito).</w:t>
       </w:r>
     </w:p>
     <w:p>
@@ -2806,7 +2878,7 @@
           <w:color w:val="1DB954"/>
           <w:sz w:val="25"/>
         </w:rPr>
-        <w:t>3.4 Escalamiento Estadístico</w:t>
+        <w:t>3.4 Escalamiento y Estandarización Estadística</w:t>
       </w:r>
     </w:p>
     <w:p>
@@ -2818,7 +2890,7 @@
           <w:color w:val="1E293B"/>
           <w:sz w:val="20"/>
         </w:rPr>
-        <w:t xml:space="preserve">Dado que variables como tempo oscilan entre 50 y 220, mientras que danceability oscila entre 0.0 y 1.0 y loudness en valores negativos de decibelios (-38 a -1), se aplicó </w:t>
+        <w:t xml:space="preserve">Dado que las variables numéricas poseen escalas y unidades muy dispares —por ejemplo, el </w:t>
       </w:r>
       <w:r>
         <w:rPr>
@@ -2826,30 +2898,225 @@
           <w:color w:val="1E293B"/>
           <w:sz w:val="20"/>
         </w:rPr>
-        <w:t>`StandardScaler` de Scikit-Learn</w:t>
+        <w:t>Tempo</w:t>
       </w:r>
       <w:r>
         <w:rPr>
           <w:color w:val="1E293B"/>
           <w:sz w:val="20"/>
         </w:rPr>
-        <w:t>:</w:t>
+        <w:t xml:space="preserve"> oscila entre 50 y 220 BPM, la </w:t>
+      </w:r>
+      <w:r>
+        <w:rPr>
+          <w:b/>
+          <w:color w:val="1E293B"/>
+          <w:sz w:val="20"/>
+        </w:rPr>
+        <w:t>Bailabilidad</w:t>
+      </w:r>
+      <w:r>
+        <w:rPr>
+          <w:color w:val="1E293B"/>
+          <w:sz w:val="20"/>
+        </w:rPr>
+        <w:t xml:space="preserve"> entre 0,0 y 1,0, y la </w:t>
+      </w:r>
+      <w:r>
+        <w:rPr>
+          <w:b/>
+          <w:color w:val="1E293B"/>
+          <w:sz w:val="20"/>
+        </w:rPr>
+        <w:t>Sonoridad</w:t>
+      </w:r>
+      <w:r>
+        <w:rPr>
+          <w:color w:val="1E293B"/>
+          <w:sz w:val="20"/>
+        </w:rPr>
+        <w:t xml:space="preserve"> en valores negativos de decibelios (-38 a -1 dB)—, se aplicó el algoritmo de estandarización </w:t>
+      </w:r>
+      <w:r>
+        <w:rPr>
+          <w:b/>
+          <w:color w:val="1E293B"/>
+          <w:sz w:val="20"/>
+        </w:rPr>
+        <w:t>StandardScaler</w:t>
+      </w:r>
+      <w:r>
+        <w:rPr>
+          <w:color w:val="1E293B"/>
+          <w:sz w:val="20"/>
+        </w:rPr>
+        <w:t xml:space="preserve"> de Scikit-Learn:</w:t>
       </w:r>
     </w:p>
     <w:p>
       <w:pPr>
-        <w:spacing w:before="60" w:after="80" w:line="276" w:lineRule="auto"/>
+        <w:spacing w:before="80" w:after="80" w:line="276" w:lineRule="auto"/>
+        <w:ind w:left="432" w:right="432"/>
       </w:pPr>
       <w:r>
         <w:rPr>
           <w:color w:val="1E293B"/>
           <w:sz w:val="20"/>
         </w:rPr>
-        <w:t>z = \frac{x - \mu}{\sigma}</w:t>
+      </w:r>
+      <w:r>
+        <w:rPr>
+          <w:b/>
+          <w:color w:val="0F172A"/>
+          <w:sz w:val="21"/>
+        </w:rPr>
+        <w:t>Fórmula de Estandarización (Puntaje Z):</w:t>
+      </w:r>
+      <w:r>
+        <w:rPr>
+          <w:color w:val="1E293B"/>
+          <w:sz w:val="20"/>
+        </w:rPr>
       </w:r>
     </w:p>
     <w:p>
       <w:pPr>
+        <w:spacing w:before="80" w:after="80" w:line="276" w:lineRule="auto"/>
+        <w:ind w:left="432" w:right="432"/>
+      </w:pPr>
+      <w:r>
+        <w:rPr>
+          <w:color w:val="1E293B"/>
+          <w:sz w:val="20"/>
+        </w:rPr>
+      </w:r>
+      <w:r>
+        <w:rPr>
+          <w:b/>
+          <w:color w:val="0F172A"/>
+          <w:sz w:val="21"/>
+        </w:rPr>
+        <w:t>z = (x - μ) / σ</w:t>
+      </w:r>
+      <w:r>
+        <w:rPr>
+          <w:color w:val="1E293B"/>
+          <w:sz w:val="20"/>
+        </w:rPr>
+      </w:r>
+    </w:p>
+    <w:p>
+      <w:pPr>
+        <w:spacing w:before="80" w:after="80" w:line="276" w:lineRule="auto"/>
+        <w:ind w:left="432" w:right="432"/>
+      </w:pPr>
+      <w:r>
+        <w:rPr>
+          <w:color w:val="1E293B"/>
+          <w:sz w:val="20"/>
+        </w:rPr>
+      </w:r>
+      <w:r>
+        <w:rPr>
+          <w:i/>
+          <w:color w:val="475569"/>
+          <w:sz w:val="19"/>
+        </w:rPr>
+        <w:t xml:space="preserve">(donde </w:t>
+      </w:r>
+      <w:r>
+        <w:rPr>
+          <w:color w:val="1E293B"/>
+          <w:sz w:val="20"/>
+        </w:rPr>
+      </w:r>
+      <w:r>
+        <w:rPr>
+          <w:i/>
+          <w:color w:val="475569"/>
+          <w:sz w:val="19"/>
+        </w:rPr>
+        <w:t>x</w:t>
+      </w:r>
+      <w:r>
+        <w:rPr>
+          <w:color w:val="1E293B"/>
+          <w:sz w:val="20"/>
+        </w:rPr>
+      </w:r>
+      <w:r>
+        <w:rPr>
+          <w:i/>
+          <w:color w:val="475569"/>
+          <w:sz w:val="19"/>
+        </w:rPr>
+        <w:t xml:space="preserve"> es el valor original del atributo, </w:t>
+      </w:r>
+      <w:r>
+        <w:rPr>
+          <w:color w:val="1E293B"/>
+          <w:sz w:val="20"/>
+        </w:rPr>
+      </w:r>
+      <w:r>
+        <w:rPr>
+          <w:i/>
+          <w:color w:val="475569"/>
+          <w:sz w:val="19"/>
+        </w:rPr>
+        <w:t>μ</w:t>
+      </w:r>
+      <w:r>
+        <w:rPr>
+          <w:color w:val="1E293B"/>
+          <w:sz w:val="20"/>
+        </w:rPr>
+      </w:r>
+      <w:r>
+        <w:rPr>
+          <w:i/>
+          <w:color w:val="475569"/>
+          <w:sz w:val="19"/>
+        </w:rPr>
+        <w:t xml:space="preserve"> es la media aritmética de la variable y </w:t>
+      </w:r>
+      <w:r>
+        <w:rPr>
+          <w:color w:val="1E293B"/>
+          <w:sz w:val="20"/>
+        </w:rPr>
+      </w:r>
+      <w:r>
+        <w:rPr>
+          <w:i/>
+          <w:color w:val="475569"/>
+          <w:sz w:val="19"/>
+        </w:rPr>
+        <w:t>σ</w:t>
+      </w:r>
+      <w:r>
+        <w:rPr>
+          <w:color w:val="1E293B"/>
+          <w:sz w:val="20"/>
+        </w:rPr>
+      </w:r>
+      <w:r>
+        <w:rPr>
+          <w:i/>
+          <w:color w:val="475569"/>
+          <w:sz w:val="19"/>
+        </w:rPr>
+        <w:t xml:space="preserve"> es su desviación estándar)</w:t>
+      </w:r>
+      <w:r>
+        <w:rPr>
+          <w:color w:val="1E293B"/>
+          <w:sz w:val="20"/>
+        </w:rPr>
+      </w:r>
+    </w:p>
+    <w:p>
+      <w:pPr>
         <w:spacing w:before="60" w:after="80" w:line="276" w:lineRule="auto"/>
       </w:pPr>
       <w:r>
@@ -2857,7 +3124,37 @@
           <w:color w:val="1E293B"/>
           <w:sz w:val="20"/>
         </w:rPr>
-        <w:t>Esto estandarizó cada atributo con media \mu = 0 y varianza unitaria \sigma^2 = 1, evitando que la magnitud de los BPM dominara erróneamente el cálculo de distancias euclidianas en K-Means y los umbrales de partición. El scaler fue guardado de forma serializada en app/models/scaler.joblib.</w:t>
+        <w:t xml:space="preserve">Este procedimiento transformó cada atributo para que tuviera una </w:t>
+      </w:r>
+      <w:r>
+        <w:rPr>
+          <w:b/>
+          <w:color w:val="1E293B"/>
+          <w:sz w:val="20"/>
+        </w:rPr>
+        <w:t>media igual a 0 (μ = 0)</w:t>
+      </w:r>
+      <w:r>
+        <w:rPr>
+          <w:color w:val="1E293B"/>
+          <w:sz w:val="20"/>
+        </w:rPr>
+        <w:t xml:space="preserve"> y una </w:t>
+      </w:r>
+      <w:r>
+        <w:rPr>
+          <w:b/>
+          <w:color w:val="1E293B"/>
+          <w:sz w:val="20"/>
+        </w:rPr>
+        <w:t>varianza unitaria (σ² = 1)</w:t>
+      </w:r>
+      <w:r>
+        <w:rPr>
+          <w:color w:val="1E293B"/>
+          <w:sz w:val="20"/>
+        </w:rPr>
+        <w:t>. Con ello se evitó que la magnitud numérica de los BPM dominara erróneamente el cálculo de distancias euclidianas en el algoritmo K-Means o sesgara los umbrales de partición del árbol. El transformador ajustado fue guardado de forma serializada en el archivo app/models/scaler.joblib.</w:t>
       </w:r>
     </w:p>
     <w:p>
@@ -2890,7 +3187,7 @@
     <w:p>
       <w:pPr>
         <w:pStyle w:val="ListBullet"/>
-        <w:spacing w:before="20" w:after="40"/>
+        <w:spacing w:before="30" w:after="50"/>
       </w:pPr>
       <w:r>
         <w:rPr>
@@ -2901,7 +3198,7 @@
       <w:r>
         <w:rPr>
           <w:b/>
-          <w:color w:val="1E293B"/>
+          <w:color w:val="0F172A"/>
           <w:sz w:val="20"/>
         </w:rPr>
         <w:t>Partición:</w:t>
@@ -2917,7 +3214,7 @@
     <w:p>
       <w:pPr>
         <w:pStyle w:val="ListBullet"/>
-        <w:spacing w:before="20" w:after="40"/>
+        <w:spacing w:before="30" w:after="50"/>
       </w:pPr>
       <w:r>
         <w:rPr>
@@ -2928,23 +3225,23 @@
       <w:r>
         <w:rPr>
           <w:b/>
+          <w:color w:val="0F172A"/>
+          <w:sz w:val="20"/>
+        </w:rPr>
+        <w:t>Estratificación:</w:t>
+      </w:r>
+      <w:r>
+        <w:rPr>
           <w:color w:val="1E293B"/>
           <w:sz w:val="20"/>
         </w:rPr>
-        <w:t>Estratificación:</w:t>
-      </w:r>
-      <w:r>
-        <w:rPr>
-          <w:color w:val="1E293B"/>
-          <w:sz w:val="20"/>
-        </w:rPr>
-        <w:t xml:space="preserve"> Se activó stratify=y para garantizar que la proporción del 25% de éxitos y 75% de no-éxitos se mantuviera idéntica en ambos subconjuntos.</w:t>
+        <w:t xml:space="preserve"> Se activó la partición estratificada (stratify=y) para garantizar que la proporción del 25% de éxitos y 75% de no-éxitos se mantuviera idéntica en ambos subconjuntos.</w:t>
       </w:r>
     </w:p>
     <w:p>
       <w:pPr>
         <w:pStyle w:val="ListBullet"/>
-        <w:spacing w:before="20" w:after="40"/>
+        <w:spacing w:before="30" w:after="50"/>
       </w:pPr>
       <w:r>
         <w:rPr>
@@ -2955,7 +3252,7 @@
       <w:r>
         <w:rPr>
           <w:b/>
-          <w:color w:val="1E293B"/>
+          <w:color w:val="0F172A"/>
           <w:sz w:val="20"/>
         </w:rPr>
         <w:t>Semilla de reproducibilidad:</w:t>
@@ -3019,7 +3316,7 @@
           <w:color w:val="1E293B"/>
           <w:sz w:val="20"/>
         </w:rPr>
-        <w:t>Se implementó el algoritmo Apriori sobre la matriz de transacciones musicales discretizadas, fijando un soporte mínimo de 0.01 (al menos 850 canciones) y filtrando las reglas por métrica de *Lift*.</w:t>
+        <w:t>Se implementó el algoritmo Apriori sobre la matriz de transacciones musicales discretizadas, fijando un soporte mínimo de 0,01 (al menos 850 canciones) y filtrando las reglas por métrica de fuerza de asociación (*Lift*).</w:t>
       </w:r>
     </w:p>
     <w:p>
@@ -3039,6 +3336,32 @@
     </w:p>
     <w:p>
       <w:pPr>
+        <w:pStyle w:val="ListBullet"/>
+        <w:spacing w:before="30" w:after="50"/>
+      </w:pPr>
+      <w:r>
+        <w:rPr>
+          <w:color w:val="1E293B"/>
+          <w:sz w:val="20"/>
+        </w:rPr>
+      </w:r>
+      <w:r>
+        <w:rPr>
+          <w:b/>
+          <w:color w:val="0F172A"/>
+          <w:sz w:val="20"/>
+        </w:rPr>
+        <w:t>Regla N° 1:</w:t>
+      </w:r>
+      <w:r>
+        <w:rPr>
+          <w:color w:val="1E293B"/>
+          <w:sz w:val="20"/>
+        </w:rPr>
+      </w:r>
+    </w:p>
+    <w:p>
+      <w:pPr>
         <w:spacing w:before="60" w:after="80" w:line="276" w:lineRule="auto"/>
       </w:pPr>
       <w:r>
@@ -3046,7 +3369,6 @@
           <w:color w:val="1E293B"/>
           <w:sz w:val="20"/>
         </w:rPr>
-        <w:t xml:space="preserve">1. </w:t>
       </w:r>
       <w:r>
         <w:rPr>
@@ -3054,7 +3376,7 @@
           <w:color w:val="1E293B"/>
           <w:sz w:val="20"/>
         </w:rPr>
-        <w:t>Regla 1:</w:t>
+        <w:t>[ Canción con Alta Popularidad ]  ➔  [ Alto Volumen de Streams  +  Género Pop ]</w:t>
       </w:r>
       <w:r>
         <w:rPr>
@@ -3065,20 +3387,129 @@
     </w:p>
     <w:p>
       <w:pPr>
-        <w:spacing w:before="60" w:after="80" w:line="276" w:lineRule="auto"/>
+        <w:pStyle w:val="ListBullet"/>
+        <w:spacing w:before="30" w:after="50"/>
       </w:pPr>
       <w:r>
         <w:rPr>
           <w:color w:val="1E293B"/>
           <w:sz w:val="20"/>
         </w:rPr>
-        <w:t>\{\text{Alta\_Popularidad}\} \Longrightarrow \{\text{Alto\_Stream}, \text{Gen\_Pop}\}</w:t>
+      </w:r>
+      <w:r>
+        <w:rPr>
+          <w:b/>
+          <w:color w:val="0F172A"/>
+          <w:sz w:val="20"/>
+        </w:rPr>
+        <w:t>Soporte:</w:t>
+      </w:r>
+      <w:r>
+        <w:rPr>
+          <w:color w:val="1E293B"/>
+          <w:sz w:val="20"/>
+        </w:rPr>
+        <w:t xml:space="preserve"> 1,21% (representa a más de 1.020 canciones del catálogo completo).</w:t>
       </w:r>
     </w:p>
     <w:p>
       <w:pPr>
         <w:pStyle w:val="ListBullet"/>
-        <w:spacing w:before="20" w:after="40"/>
+        <w:spacing w:before="30" w:after="50"/>
+      </w:pPr>
+      <w:r>
+        <w:rPr>
+          <w:color w:val="1E293B"/>
+          <w:sz w:val="20"/>
+        </w:rPr>
+      </w:r>
+      <w:r>
+        <w:rPr>
+          <w:b/>
+          <w:color w:val="0F172A"/>
+          <w:sz w:val="20"/>
+        </w:rPr>
+        <w:t>Confianza:</w:t>
+      </w:r>
+      <w:r>
+        <w:rPr>
+          <w:color w:val="1E293B"/>
+          <w:sz w:val="20"/>
+        </w:rPr>
+        <w:t xml:space="preserve"> 6,69%.</w:t>
+      </w:r>
+    </w:p>
+    <w:p>
+      <w:pPr>
+        <w:pStyle w:val="ListBullet"/>
+        <w:spacing w:before="30" w:after="50"/>
+      </w:pPr>
+      <w:r>
+        <w:rPr>
+          <w:color w:val="1E293B"/>
+          <w:sz w:val="20"/>
+        </w:rPr>
+      </w:r>
+      <w:r>
+        <w:rPr>
+          <w:b/>
+          <w:color w:val="0F172A"/>
+          <w:sz w:val="20"/>
+        </w:rPr>
+        <w:t>Fuerza de Asociación (Lift):</w:t>
+      </w:r>
+      <w:r>
+        <w:rPr>
+          <w:color w:val="1E293B"/>
+          <w:sz w:val="20"/>
+        </w:rPr>
+        <w:t xml:space="preserve"> </w:t>
+      </w:r>
+      <w:r>
+        <w:rPr>
+          <w:b/>
+          <w:color w:val="0F172A"/>
+          <w:sz w:val="20"/>
+        </w:rPr>
+        <w:t>3,40</w:t>
+      </w:r>
+      <w:r>
+        <w:rPr>
+          <w:color w:val="1E293B"/>
+          <w:sz w:val="20"/>
+        </w:rPr>
+        <w:t xml:space="preserve"> (multiplicador de probabilidad respecto al azar).</w:t>
+      </w:r>
+    </w:p>
+    <w:p>
+      <w:pPr>
+        <w:pStyle w:val="ListBullet"/>
+        <w:spacing w:before="30" w:after="50"/>
+      </w:pPr>
+      <w:r>
+        <w:rPr>
+          <w:color w:val="1E293B"/>
+          <w:sz w:val="20"/>
+        </w:rPr>
+      </w:r>
+      <w:r>
+        <w:rPr>
+          <w:b/>
+          <w:color w:val="0F172A"/>
+          <w:sz w:val="20"/>
+        </w:rPr>
+        <w:t>Regla N° 2:</w:t>
+      </w:r>
+      <w:r>
+        <w:rPr>
+          <w:color w:val="1E293B"/>
+          <w:sz w:val="20"/>
+        </w:rPr>
+      </w:r>
+    </w:p>
+    <w:p>
+      <w:pPr>
+        <w:spacing w:before="60" w:after="80" w:line="276" w:lineRule="auto"/>
       </w:pPr>
       <w:r>
         <w:rPr>
@@ -3092,20 +3523,154 @@
           <w:color w:val="1E293B"/>
           <w:sz w:val="20"/>
         </w:rPr>
-        <w:t>Soporte:</w:t>
+        <w:t>[ Alto Volumen de Streams  +  Género Pop ]  ➔  [ Canción con Alta Popularidad ]</w:t>
       </w:r>
       <w:r>
         <w:rPr>
           <w:color w:val="1E293B"/>
           <w:sz w:val="20"/>
         </w:rPr>
-        <w:t xml:space="preserve"> 0.0121 (1.21% de todo el catálogo).</w:t>
       </w:r>
     </w:p>
     <w:p>
       <w:pPr>
         <w:pStyle w:val="ListBullet"/>
-        <w:spacing w:before="20" w:after="40"/>
+        <w:spacing w:before="30" w:after="50"/>
+      </w:pPr>
+      <w:r>
+        <w:rPr>
+          <w:color w:val="1E293B"/>
+          <w:sz w:val="20"/>
+        </w:rPr>
+      </w:r>
+      <w:r>
+        <w:rPr>
+          <w:b/>
+          <w:color w:val="0F172A"/>
+          <w:sz w:val="20"/>
+        </w:rPr>
+        <w:t>Soporte:</w:t>
+      </w:r>
+      <w:r>
+        <w:rPr>
+          <w:color w:val="1E293B"/>
+          <w:sz w:val="20"/>
+        </w:rPr>
+        <w:t xml:space="preserve"> 1,21%.</w:t>
+      </w:r>
+    </w:p>
+    <w:p>
+      <w:pPr>
+        <w:pStyle w:val="ListBullet"/>
+        <w:spacing w:before="30" w:after="50"/>
+      </w:pPr>
+      <w:r>
+        <w:rPr>
+          <w:color w:val="1E293B"/>
+          <w:sz w:val="20"/>
+        </w:rPr>
+      </w:r>
+      <w:r>
+        <w:rPr>
+          <w:b/>
+          <w:color w:val="0F172A"/>
+          <w:sz w:val="20"/>
+        </w:rPr>
+        <w:t>Confianza:</w:t>
+      </w:r>
+      <w:r>
+        <w:rPr>
+          <w:color w:val="1E293B"/>
+          <w:sz w:val="20"/>
+        </w:rPr>
+        <w:t xml:space="preserve"> </w:t>
+      </w:r>
+      <w:r>
+        <w:rPr>
+          <w:b/>
+          <w:color w:val="0F172A"/>
+          <w:sz w:val="20"/>
+        </w:rPr>
+        <w:t>61,33%</w:t>
+      </w:r>
+      <w:r>
+        <w:rPr>
+          <w:color w:val="1E293B"/>
+          <w:sz w:val="20"/>
+        </w:rPr>
+        <w:t xml:space="preserve"> (el 61,3% de los temas Pop con alto streaming alcanzan alta popularidad en la plataforma).</w:t>
+      </w:r>
+    </w:p>
+    <w:p>
+      <w:pPr>
+        <w:pStyle w:val="ListBullet"/>
+        <w:spacing w:before="30" w:after="50"/>
+      </w:pPr>
+      <w:r>
+        <w:rPr>
+          <w:color w:val="1E293B"/>
+          <w:sz w:val="20"/>
+        </w:rPr>
+      </w:r>
+      <w:r>
+        <w:rPr>
+          <w:b/>
+          <w:color w:val="0F172A"/>
+          <w:sz w:val="20"/>
+        </w:rPr>
+        <w:t>Fuerza de Asociación (Lift):</w:t>
+      </w:r>
+      <w:r>
+        <w:rPr>
+          <w:color w:val="1E293B"/>
+          <w:sz w:val="20"/>
+        </w:rPr>
+        <w:t xml:space="preserve"> </w:t>
+      </w:r>
+      <w:r>
+        <w:rPr>
+          <w:b/>
+          <w:color w:val="0F172A"/>
+          <w:sz w:val="20"/>
+        </w:rPr>
+        <w:t>3,40</w:t>
+      </w:r>
+      <w:r>
+        <w:rPr>
+          <w:color w:val="1E293B"/>
+          <w:sz w:val="20"/>
+        </w:rPr>
+      </w:r>
+    </w:p>
+    <w:p>
+      <w:pPr>
+        <w:pStyle w:val="ListBullet"/>
+        <w:spacing w:before="30" w:after="50"/>
+      </w:pPr>
+      <w:r>
+        <w:rPr>
+          <w:color w:val="1E293B"/>
+          <w:sz w:val="20"/>
+        </w:rPr>
+      </w:r>
+      <w:r>
+        <w:rPr>
+          <w:b/>
+          <w:color w:val="0F172A"/>
+          <w:sz w:val="20"/>
+        </w:rPr>
+        <w:t>Regla N° 3:</w:t>
+      </w:r>
+      <w:r>
+        <w:rPr>
+          <w:color w:val="1E293B"/>
+          <w:sz w:val="20"/>
+        </w:rPr>
+      </w:r>
+    </w:p>
+    <w:p>
+      <w:pPr>
+        <w:spacing w:before="60" w:after="80" w:line="276" w:lineRule="auto"/>
       </w:pPr>
       <w:r>
         <w:rPr>
@@ -3119,20 +3684,19 @@
           <w:color w:val="1E293B"/>
           <w:sz w:val="20"/>
         </w:rPr>
-        <w:t>Confianza:</w:t>
+        <w:t>[ Género R&amp;B  +  Alto Volumen de Streams ]  ➔  [ Canción con Alta Popularidad ]</w:t>
       </w:r>
       <w:r>
         <w:rPr>
           <w:color w:val="1E293B"/>
           <w:sz w:val="20"/>
         </w:rPr>
-        <w:t xml:space="preserve"> 0.0669.</w:t>
       </w:r>
     </w:p>
     <w:p>
       <w:pPr>
         <w:pStyle w:val="ListBullet"/>
-        <w:spacing w:before="20" w:after="40"/>
+        <w:spacing w:before="30" w:after="50"/>
       </w:pPr>
       <w:r>
         <w:rPr>
@@ -3143,321 +3707,94 @@
       <w:r>
         <w:rPr>
           <w:b/>
+          <w:color w:val="0F172A"/>
+          <w:sz w:val="20"/>
+        </w:rPr>
+        <w:t>Soporte:</w:t>
+      </w:r>
+      <w:r>
+        <w:rPr>
           <w:color w:val="1E293B"/>
           <w:sz w:val="20"/>
         </w:rPr>
-        <w:t>Lift:</w:t>
-      </w:r>
-      <w:r>
-        <w:rPr>
-          <w:color w:val="1E293B"/>
-          <w:sz w:val="20"/>
-        </w:rPr>
-        <w:t xml:space="preserve"> </w:t>
-      </w:r>
-      <w:r>
-        <w:rPr>
-          <w:b/>
-          <w:color w:val="1E293B"/>
-          <w:sz w:val="20"/>
-        </w:rPr>
-        <w:t>$3.3971$</w:t>
-      </w:r>
-      <w:r>
-        <w:rPr>
-          <w:color w:val="1E293B"/>
-          <w:sz w:val="20"/>
-        </w:rPr>
+        <w:t xml:space="preserve"> 1,23%.</w:t>
       </w:r>
     </w:p>
     <w:p>
       <w:pPr>
-        <w:spacing w:before="60" w:after="80" w:line="276" w:lineRule="auto"/>
+        <w:pStyle w:val="ListBullet"/>
+        <w:spacing w:before="30" w:after="50"/>
       </w:pPr>
       <w:r>
         <w:rPr>
           <w:color w:val="1E293B"/>
           <w:sz w:val="20"/>
         </w:rPr>
-        <w:t xml:space="preserve">2. </w:t>
       </w:r>
       <w:r>
         <w:rPr>
           <w:b/>
+          <w:color w:val="0F172A"/>
+          <w:sz w:val="20"/>
+        </w:rPr>
+        <w:t>Confianza:</w:t>
+      </w:r>
+      <w:r>
+        <w:rPr>
           <w:color w:val="1E293B"/>
           <w:sz w:val="20"/>
         </w:rPr>
-        <w:t>Regla 2:</w:t>
+        <w:t xml:space="preserve"> </w:t>
+      </w:r>
+      <w:r>
+        <w:rPr>
+          <w:b/>
+          <w:color w:val="0F172A"/>
+          <w:sz w:val="20"/>
+        </w:rPr>
+        <w:t>60,03%</w:t>
       </w:r>
       <w:r>
         <w:rPr>
           <w:color w:val="1E293B"/>
           <w:sz w:val="20"/>
         </w:rPr>
+        <w:t xml:space="preserve"> (6 de cada 10 canciones de R&amp;B con alta tracción logran posicionarse en alta popularidad).</w:t>
       </w:r>
     </w:p>
     <w:p>
       <w:pPr>
-        <w:spacing w:before="60" w:after="80" w:line="276" w:lineRule="auto"/>
+        <w:pStyle w:val="ListBullet"/>
+        <w:spacing w:before="30" w:after="50"/>
       </w:pPr>
       <w:r>
         <w:rPr>
           <w:color w:val="1E293B"/>
           <w:sz w:val="20"/>
         </w:rPr>
-        <w:t>\{\text{Alto\_Stream}, \text{Gen\_Pop}\} \Longrightarrow \{\text{Alta\_Popularidad}\}</w:t>
-      </w:r>
-    </w:p>
-    <w:p>
-      <w:pPr>
-        <w:pStyle w:val="ListBullet"/>
-        <w:spacing w:before="20" w:after="40"/>
-      </w:pPr>
+      </w:r>
+      <w:r>
+        <w:rPr>
+          <w:b/>
+          <w:color w:val="0F172A"/>
+          <w:sz w:val="20"/>
+        </w:rPr>
+        <w:t>Fuerza de Asociación (Lift):</w:t>
+      </w:r>
       <w:r>
         <w:rPr>
           <w:color w:val="1E293B"/>
           <w:sz w:val="20"/>
         </w:rPr>
+        <w:t xml:space="preserve"> </w:t>
       </w:r>
       <w:r>
         <w:rPr>
           <w:b/>
-          <w:color w:val="1E293B"/>
-          <w:sz w:val="20"/>
-        </w:rPr>
-        <w:t>Soporte:</w:t>
-      </w:r>
-      <w:r>
-        <w:rPr>
-          <w:color w:val="1E293B"/>
-          <w:sz w:val="20"/>
-        </w:rPr>
-        <w:t xml:space="preserve"> 0.0121.</w:t>
-      </w:r>
-    </w:p>
-    <w:p>
-      <w:pPr>
-        <w:pStyle w:val="ListBullet"/>
-        <w:spacing w:before="20" w:after="40"/>
-      </w:pPr>
-      <w:r>
-        <w:rPr>
-          <w:color w:val="1E293B"/>
-          <w:sz w:val="20"/>
-        </w:rPr>
-      </w:r>
-      <w:r>
-        <w:rPr>
-          <w:b/>
-          <w:color w:val="1E293B"/>
-          <w:sz w:val="20"/>
-        </w:rPr>
-        <w:t>Confianza:</w:t>
-      </w:r>
-      <w:r>
-        <w:rPr>
-          <w:color w:val="1E293B"/>
-          <w:sz w:val="20"/>
-        </w:rPr>
-        <w:t xml:space="preserve"> </w:t>
-      </w:r>
-      <w:r>
-        <w:rPr>
-          <w:b/>
-          <w:color w:val="1E293B"/>
-          <w:sz w:val="20"/>
-        </w:rPr>
-        <w:t>$0.6133$</w:t>
-      </w:r>
-      <w:r>
-        <w:rPr>
-          <w:color w:val="1E293B"/>
-          <w:sz w:val="20"/>
-        </w:rPr>
-        <w:t xml:space="preserve"> (61.33% de probabilidad condicional).</w:t>
-      </w:r>
-    </w:p>
-    <w:p>
-      <w:pPr>
-        <w:pStyle w:val="ListBullet"/>
-        <w:spacing w:before="20" w:after="40"/>
-      </w:pPr>
-      <w:r>
-        <w:rPr>
-          <w:color w:val="1E293B"/>
-          <w:sz w:val="20"/>
-        </w:rPr>
-      </w:r>
-      <w:r>
-        <w:rPr>
-          <w:b/>
-          <w:color w:val="1E293B"/>
-          <w:sz w:val="20"/>
-        </w:rPr>
-        <w:t>Lift:</w:t>
-      </w:r>
-      <w:r>
-        <w:rPr>
-          <w:color w:val="1E293B"/>
-          <w:sz w:val="20"/>
-        </w:rPr>
-        <w:t xml:space="preserve"> </w:t>
-      </w:r>
-      <w:r>
-        <w:rPr>
-          <w:b/>
-          <w:color w:val="1E293B"/>
-          <w:sz w:val="20"/>
-        </w:rPr>
-        <w:t>$3.3971$</w:t>
-      </w:r>
-      <w:r>
-        <w:rPr>
-          <w:color w:val="1E293B"/>
-          <w:sz w:val="20"/>
-        </w:rPr>
-      </w:r>
-    </w:p>
-    <w:p>
-      <w:pPr>
-        <w:spacing w:before="60" w:after="80" w:line="276" w:lineRule="auto"/>
-      </w:pPr>
-      <w:r>
-        <w:rPr>
-          <w:color w:val="1E293B"/>
-          <w:sz w:val="20"/>
-        </w:rPr>
-        <w:t xml:space="preserve">3. </w:t>
-      </w:r>
-      <w:r>
-        <w:rPr>
-          <w:b/>
-          <w:color w:val="1E293B"/>
-          <w:sz w:val="20"/>
-        </w:rPr>
-        <w:t>Regla 3:</w:t>
-      </w:r>
-      <w:r>
-        <w:rPr>
-          <w:color w:val="1E293B"/>
-          <w:sz w:val="20"/>
-        </w:rPr>
-      </w:r>
-    </w:p>
-    <w:p>
-      <w:pPr>
-        <w:spacing w:before="60" w:after="80" w:line="276" w:lineRule="auto"/>
-      </w:pPr>
-      <w:r>
-        <w:rPr>
-          <w:color w:val="1E293B"/>
-          <w:sz w:val="20"/>
-        </w:rPr>
-        <w:t>\{\text{Gen\_R\&amp;B}, \text{Alto\_Stream}\} \Longrightarrow \{\text{Alta\_Popularidad}\}</w:t>
-      </w:r>
-    </w:p>
-    <w:p>
-      <w:pPr>
-        <w:pStyle w:val="ListBullet"/>
-        <w:spacing w:before="20" w:after="40"/>
-      </w:pPr>
-      <w:r>
-        <w:rPr>
-          <w:color w:val="1E293B"/>
-          <w:sz w:val="20"/>
-        </w:rPr>
-      </w:r>
-      <w:r>
-        <w:rPr>
-          <w:b/>
-          <w:color w:val="1E293B"/>
-          <w:sz w:val="20"/>
-        </w:rPr>
-        <w:t>Soporte:</w:t>
-      </w:r>
-      <w:r>
-        <w:rPr>
-          <w:color w:val="1E293B"/>
-          <w:sz w:val="20"/>
-        </w:rPr>
-        <w:t xml:space="preserve"> 0.0123.</w:t>
-      </w:r>
-    </w:p>
-    <w:p>
-      <w:pPr>
-        <w:pStyle w:val="ListBullet"/>
-        <w:spacing w:before="20" w:after="40"/>
-      </w:pPr>
-      <w:r>
-        <w:rPr>
-          <w:color w:val="1E293B"/>
-          <w:sz w:val="20"/>
-        </w:rPr>
-      </w:r>
-      <w:r>
-        <w:rPr>
-          <w:b/>
-          <w:color w:val="1E293B"/>
-          <w:sz w:val="20"/>
-        </w:rPr>
-        <w:t>Confianza:</w:t>
-      </w:r>
-      <w:r>
-        <w:rPr>
-          <w:color w:val="1E293B"/>
-          <w:sz w:val="20"/>
-        </w:rPr>
-        <w:t xml:space="preserve"> </w:t>
-      </w:r>
-      <w:r>
-        <w:rPr>
-          <w:b/>
-          <w:color w:val="1E293B"/>
-          <w:sz w:val="20"/>
-        </w:rPr>
-        <w:t>$0.6003$</w:t>
-      </w:r>
-      <w:r>
-        <w:rPr>
-          <w:color w:val="1E293B"/>
-          <w:sz w:val="20"/>
-        </w:rPr>
-        <w:t xml:space="preserve"> (60.03% de probabilidad condicional).</w:t>
-      </w:r>
-    </w:p>
-    <w:p>
-      <w:pPr>
-        <w:pStyle w:val="ListBullet"/>
-        <w:spacing w:before="20" w:after="40"/>
-      </w:pPr>
-      <w:r>
-        <w:rPr>
-          <w:color w:val="1E293B"/>
-          <w:sz w:val="20"/>
-        </w:rPr>
-      </w:r>
-      <w:r>
-        <w:rPr>
-          <w:b/>
-          <w:color w:val="1E293B"/>
-          <w:sz w:val="20"/>
-        </w:rPr>
-        <w:t>Lift:</w:t>
-      </w:r>
-      <w:r>
-        <w:rPr>
-          <w:color w:val="1E293B"/>
-          <w:sz w:val="20"/>
-        </w:rPr>
-        <w:t xml:space="preserve"> </w:t>
-      </w:r>
-      <w:r>
-        <w:rPr>
-          <w:b/>
-          <w:color w:val="1E293B"/>
-          <w:sz w:val="20"/>
-        </w:rPr>
-        <w:t>$3.3255$</w:t>
+          <w:color w:val="0F172A"/>
+          <w:sz w:val="20"/>
+        </w:rPr>
+        <w:t>3,33</w:t>
       </w:r>
       <w:r>
         <w:rPr>
@@ -3490,7 +3827,7 @@
           <w:color w:val="1E293B"/>
           <w:sz w:val="20"/>
         </w:rPr>
-        <w:t xml:space="preserve">El valor de Lift &gt; 3.3 en las tres reglas demuestra una relación sustantiva muy superior a la mera casualidad estadística. Para una discográfica, esto significa que cuando una pista del género </w:t>
+        <w:t xml:space="preserve">El valor de </w:t>
       </w:r>
       <w:r>
         <w:rPr>
@@ -3498,14 +3835,14 @@
           <w:color w:val="1E293B"/>
           <w:sz w:val="20"/>
         </w:rPr>
-        <w:t>Pop</w:t>
+        <w:t>Lift superior a 3,3</w:t>
       </w:r>
       <w:r>
         <w:rPr>
           <w:color w:val="1E293B"/>
           <w:sz w:val="20"/>
         </w:rPr>
-        <w:t xml:space="preserve"> o </w:t>
+        <w:t xml:space="preserve"> en las tres reglas demuestra una relación sustantiva muy superior a la mera casualidad estadística. Para una discográfica o sello musical, esto significa que cuando una pista del género </w:t>
       </w:r>
       <w:r>
         <w:rPr>
@@ -3513,6 +3850,21 @@
           <w:color w:val="1E293B"/>
           <w:sz w:val="20"/>
         </w:rPr>
+        <w:t>Pop</w:t>
+      </w:r>
+      <w:r>
+        <w:rPr>
+          <w:color w:val="1E293B"/>
+          <w:sz w:val="20"/>
+        </w:rPr>
+        <w:t xml:space="preserve"> o </w:t>
+      </w:r>
+      <w:r>
+        <w:rPr>
+          <w:b/>
+          <w:color w:val="1E293B"/>
+          <w:sz w:val="20"/>
+        </w:rPr>
         <w:t>R&amp;B</w:t>
       </w:r>
       <w:r>
@@ -3520,7 +3872,7 @@
           <w:color w:val="1E293B"/>
           <w:sz w:val="20"/>
         </w:rPr>
-        <w:t xml:space="preserve"> logra traccionar volumen de escuchas (Alto_Stream), la probabilidad de que se convierta en un fenómeno de alta popularidad transversal en la plataforma se triplica en comparación con cualquier otro género del catálogo. Las reglas fueron exportadas a app/models/reglas_apriori.json para ser consumidas por la API.</w:t>
+        <w:t xml:space="preserve"> logra traccionar volumen inicial de escuchas (*Alto Stream*), la probabilidad de que se convierta en un fenómeno de alta popularidad transversal en la plataforma se triplica en comparación con cualquier otro género del catálogo. Las reglas fueron exportadas a app/models/reglas_apriori.json para ser consumidas dinámicamente por la API.</w:t>
       </w:r>
     </w:p>
     <w:p>
@@ -3547,7 +3899,7 @@
           <w:color w:val="1E293B"/>
           <w:sz w:val="20"/>
         </w:rPr>
-        <w:t>Se entrenó el algoritmo K-Means sobre las 6 características acústicas normalizadas (tempo, danceability, energy, loudness, instrumentalness, explicit).</w:t>
+        <w:t>Se entrenó el algoritmo K-Means sobre las 6 características acústicas normalizadas (Tempo, Bailabilidad, Energía, Sonoridad, Instrumentalidad y Contenido Explícito).</w:t>
       </w:r>
     </w:p>
     <w:p>
@@ -3562,7 +3914,7 @@
           <w:color w:val="475569"/>
           <w:sz w:val="22"/>
         </w:rPr>
-        <w:t>Justificación de la Elección de $K$:</w:t>
+        <w:t>Justificación de la Elección de K:</w:t>
       </w:r>
     </w:p>
     <w:p>
@@ -3574,7 +3926,7 @@
           <w:color w:val="1E293B"/>
           <w:sz w:val="20"/>
         </w:rPr>
-        <w:t>Se evaluaron valores de K \in [2, 8] mediante dos métodos cuantitativos:</w:t>
+        <w:t>Se evaluaron diferentes valores para el número de grupos entre 2 y 8 (K = 2, 3, ..., 8) mediante dos métodos cuantitativos:</w:t>
       </w:r>
     </w:p>
     <w:p>
@@ -3601,7 +3953,22 @@
           <w:color w:val="1E293B"/>
           <w:sz w:val="20"/>
         </w:rPr>
-        <w:t xml:space="preserve"> La curva de suma de distancias al cuadrado intracluster (Inercia) evidenció una marcada desaceleración en la tasa de reducción de error a partir de K=4 (pasando de una reducción pronunciada entre 2 y 4 a una asíntota suave entre 5 y 8).</w:t>
+        <w:t xml:space="preserve"> La curva de suma de distancias al cuadrado intracluster (Inercia) evidenció una marcada desaceleración en la tasa de reducción de error a partir de </w:t>
+      </w:r>
+      <w:r>
+        <w:rPr>
+          <w:b/>
+          <w:color w:val="1E293B"/>
+          <w:sz w:val="20"/>
+        </w:rPr>
+        <w:t>K = 4</w:t>
+      </w:r>
+      <w:r>
+        <w:rPr>
+          <w:color w:val="1E293B"/>
+          <w:sz w:val="20"/>
+        </w:rPr>
+        <w:t xml:space="preserve"> (pasando de una reducción pronunciada entre 2 y 4 a una asíntota suave entre 5 y 8).</w:t>
       </w:r>
     </w:p>
     <w:p>
@@ -3628,7 +3995,22 @@
           <w:color w:val="1E293B"/>
           <w:sz w:val="20"/>
         </w:rPr>
-        <w:t xml:space="preserve"> El valor promedio de silueta alcanzó su punto de mayor estabilidad y coherencia de separación geométrica en K=4 (\text{Silhouette Score} \approx 0.38).</w:t>
+        <w:t xml:space="preserve"> El valor promedio de silueta alcanzó su punto de mayor estabilidad y coherencia de separación geométrica en </w:t>
+      </w:r>
+      <w:r>
+        <w:rPr>
+          <w:b/>
+          <w:color w:val="1E293B"/>
+          <w:sz w:val="20"/>
+        </w:rPr>
+        <w:t>K = 4</w:t>
+      </w:r>
+      <w:r>
+        <w:rPr>
+          <w:color w:val="1E293B"/>
+          <w:sz w:val="20"/>
+        </w:rPr>
+        <w:t xml:space="preserve"> (Puntuación de Silueta ≈ 0,38).</w:t>
       </w:r>
     </w:p>
     <w:p>
@@ -3703,7 +4085,7 @@
     <w:p>
       <w:pPr>
         <w:pStyle w:val="ListBullet"/>
-        <w:spacing w:before="20" w:after="40"/>
+        <w:spacing w:before="30" w:after="50"/>
       </w:pPr>
       <w:r>
         <w:rPr>
@@ -3714,7 +4096,7 @@
       <w:r>
         <w:rPr>
           <w:b/>
-          <w:color w:val="1E293B"/>
+          <w:color w:val="0F172A"/>
           <w:sz w:val="20"/>
         </w:rPr>
         <w:t>Cluster 0 — "Acústico, Instrumental &amp; Chill" (Baja Energía, Alta Instrumentalidad):</w:t>
@@ -3730,7 +4112,7 @@
     <w:p>
       <w:pPr>
         <w:pStyle w:val="ListBullet"/>
-        <w:spacing w:before="20" w:after="40"/>
+        <w:spacing w:before="30" w:after="50"/>
       </w:pPr>
       <w:r>
         <w:rPr>
@@ -3741,7 +4123,7 @@
       <w:r>
         <w:rPr>
           <w:b/>
-          <w:color w:val="1E293B"/>
+          <w:color w:val="0F172A"/>
           <w:sz w:val="20"/>
         </w:rPr>
         <w:t>Cluster 1 — "Pop Comercial &amp; Radio FM" (Alta Bailabilidad, Energía Media-Alta, No Explícito):</w:t>
@@ -3757,7 +4139,7 @@
     <w:p>
       <w:pPr>
         <w:pStyle w:val="ListBullet"/>
-        <w:spacing w:before="20" w:after="40"/>
+        <w:spacing w:before="30" w:after="50"/>
       </w:pPr>
       <w:r>
         <w:rPr>
@@ -3768,7 +4150,7 @@
       <w:r>
         <w:rPr>
           <w:b/>
-          <w:color w:val="1E293B"/>
+          <w:color w:val="0F172A"/>
           <w:sz w:val="20"/>
         </w:rPr>
         <w:t>Cluster 2 — "Rock, Electrónica &amp; Alta Potencia" (Máxima Energía, Alto Loudness, BPM elevado):</w:t>
@@ -3784,7 +4166,7 @@
     <w:p>
       <w:pPr>
         <w:pStyle w:val="ListBullet"/>
-        <w:spacing w:before="20" w:after="40"/>
+        <w:spacing w:before="30" w:after="50"/>
       </w:pPr>
       <w:r>
         <w:rPr>
@@ -3795,7 +4177,7 @@
       <w:r>
         <w:rPr>
           <w:b/>
-          <w:color w:val="1E293B"/>
+          <w:color w:val="0F172A"/>
           <w:sz w:val="20"/>
         </w:rPr>
         <w:t>Cluster 3 — "Urbano, Trap &amp; Modern Hits" (Alta Bailabilidad, Contenido Explícito Dominante):</w:t>
@@ -3877,42 +4259,27 @@
     <w:p>
       <w:pPr>
         <w:pStyle w:val="ListBullet"/>
-        <w:spacing w:before="20" w:after="40"/>
+        <w:spacing w:before="30" w:after="50"/>
       </w:pPr>
       <w:r>
         <w:rPr>
           <w:color w:val="1E293B"/>
           <w:sz w:val="20"/>
         </w:rPr>
-        <w:t>Para \text{max\_depth} \ge 8, el árbol memorizaba el conjunto de entrenamiento (Accuracy de train &gt; 84\%), pero el desempeño en validación caía drásticamente por debajo del 52% (sobreajuste severo).</w:t>
+        <w:t>Para profundidades iguales o mayores a 8 (max_depth ≥ 8), el árbol memorizaba el conjunto de entrenamiento (Exactitud de entrenamiento superior al 84%), pero el desempeño en validación caía drásticamente por debajo del 52% (sobreajuste severo).</w:t>
       </w:r>
     </w:p>
     <w:p>
       <w:pPr>
         <w:pStyle w:val="ListBullet"/>
-        <w:spacing w:before="20" w:after="40"/>
+        <w:spacing w:before="30" w:after="50"/>
       </w:pPr>
       <w:r>
         <w:rPr>
           <w:color w:val="1E293B"/>
           <w:sz w:val="20"/>
         </w:rPr>
-        <w:t xml:space="preserve">Se seleccionó deliberadamente </w:t>
-      </w:r>
-      <w:r>
-        <w:rPr>
-          <w:b/>
-          <w:color w:val="1E293B"/>
-          <w:sz w:val="20"/>
-        </w:rPr>
-        <w:t>`max_depth = 3`</w:t>
-      </w:r>
-      <w:r>
-        <w:rPr>
-          <w:color w:val="1E293B"/>
-          <w:sz w:val="20"/>
-        </w:rPr>
-        <w:t xml:space="preserve"> con criterio criterion='gini'. Esta configuración garantiza:</w:t>
+        <w:t>Se seleccionó deliberadamente una profundidad máxima de 3 (max_depth = 3) con criterio de impureza de Gini (criterion='gini'). Esta configuración garantiza:</w:t>
       </w:r>
     </w:p>
     <w:p>
@@ -4040,7 +4407,7 @@
     <w:p>
       <w:pPr>
         <w:pStyle w:val="ListBullet"/>
-        <w:spacing w:before="20" w:after="40"/>
+        <w:spacing w:before="30" w:after="50"/>
       </w:pPr>
       <w:r>
         <w:rPr>
@@ -4051,7 +4418,7 @@
       <w:r>
         <w:rPr>
           <w:b/>
-          <w:color w:val="1E293B"/>
+          <w:color w:val="0F172A"/>
           <w:sz w:val="20"/>
         </w:rPr>
         <w:t>Verdaderos Negativos (TN):</w:t>
@@ -4067,7 +4434,7 @@
     <w:p>
       <w:pPr>
         <w:pStyle w:val="ListBullet"/>
-        <w:spacing w:before="20" w:after="40"/>
+        <w:spacing w:before="30" w:after="50"/>
       </w:pPr>
       <w:r>
         <w:rPr>
@@ -4078,7 +4445,7 @@
       <w:r>
         <w:rPr>
           <w:b/>
-          <w:color w:val="1E293B"/>
+          <w:color w:val="0F172A"/>
           <w:sz w:val="20"/>
         </w:rPr>
         <w:t>Falsos Positivos (FP):</w:t>
@@ -4094,7 +4461,7 @@
     <w:p>
       <w:pPr>
         <w:pStyle w:val="ListBullet"/>
-        <w:spacing w:before="20" w:after="40"/>
+        <w:spacing w:before="30" w:after="50"/>
       </w:pPr>
       <w:r>
         <w:rPr>
@@ -4105,7 +4472,7 @@
       <w:r>
         <w:rPr>
           <w:b/>
-          <w:color w:val="1E293B"/>
+          <w:color w:val="0F172A"/>
           <w:sz w:val="20"/>
         </w:rPr>
         <w:t>Falsos Negativos (FN):</w:t>
@@ -4121,7 +4488,7 @@
     <w:p>
       <w:pPr>
         <w:pStyle w:val="ListBullet"/>
-        <w:spacing w:before="20" w:after="40"/>
+        <w:spacing w:before="30" w:after="50"/>
       </w:pPr>
       <w:r>
         <w:rPr>
@@ -4132,7 +4499,7 @@
       <w:r>
         <w:rPr>
           <w:b/>
-          <w:color w:val="1E293B"/>
+          <w:color w:val="0F172A"/>
           <w:sz w:val="20"/>
         </w:rPr>
         <w:t>Verdaderos Positivos (TP):</w:t>
@@ -4204,7 +4571,7 @@
           <w:color w:val="1E293B"/>
           <w:sz w:val="20"/>
         </w:rPr>
-        <w:t>Exactitud Global (Accuracy) del $57.95\%$</w:t>
+        <w:t>Exactitud Global (Accuracy) del 57,95%</w:t>
       </w:r>
       <w:r>
         <w:rPr>
@@ -4249,7 +4616,7 @@
                 <w:color w:val="FFFFFF"/>
                 <w:sz w:val="18"/>
               </w:rPr>
-              <w:t>Clase</w:t>
+              <w:t>Categoría</w:t>
             </w:r>
           </w:p>
         </w:tc>
@@ -4324,7 +4691,7 @@
                 <w:color w:val="FFFFFF"/>
                 <w:sz w:val="18"/>
               </w:rPr>
-              <w:t>F1-Score</w:t>
+              <w:t>Puntuación F1 (F1-Score)</w:t>
             </w:r>
           </w:p>
         </w:tc>
@@ -4349,7 +4716,7 @@
                 <w:color w:val="FFFFFF"/>
                 <w:sz w:val="18"/>
               </w:rPr>
-              <w:t>Soporte de Prueba</w:t>
+              <w:t>Canciones Evaluadas</w:t>
             </w:r>
           </w:p>
         </w:tc>
@@ -4374,7 +4741,7 @@
                 <w:color w:val="1E293B"/>
                 <w:sz w:val="18"/>
               </w:rPr>
-              <w:t>Clase 0 (Estándar)</w:t>
+              <w:t>Clase 0 (Consumo Estándar)</w:t>
             </w:r>
           </w:p>
         </w:tc>
@@ -4397,7 +4764,7 @@
                 <w:color w:val="1E293B"/>
                 <w:sz w:val="18"/>
               </w:rPr>
-              <w:t>0.74</w:t>
+              <w:t>0,74 (74%)</w:t>
             </w:r>
           </w:p>
         </w:tc>
@@ -4420,7 +4787,7 @@
                 <w:color w:val="1E293B"/>
                 <w:sz w:val="18"/>
               </w:rPr>
-              <w:t>0.66</w:t>
+              <w:t>0,66 (66%)</w:t>
             </w:r>
           </w:p>
         </w:tc>
@@ -4443,7 +4810,7 @@
                 <w:color w:val="1E293B"/>
                 <w:sz w:val="18"/>
               </w:rPr>
-              <w:t>0.70</w:t>
+              <w:t>0,70</w:t>
             </w:r>
           </w:p>
         </w:tc>
@@ -4466,7 +4833,7 @@
                 <w:color w:val="1E293B"/>
                 <w:sz w:val="18"/>
               </w:rPr>
-              <w:t>12.521</w:t>
+              <w:t>12.521 temas</w:t>
             </w:r>
           </w:p>
         </w:tc>
@@ -4492,7 +4859,7 @@
                 <w:color w:val="1E293B"/>
                 <w:sz w:val="18"/>
               </w:rPr>
-              <w:t>Clase 1 (Éxito)</w:t>
+              <w:t>Clase 1 (Éxito Comercial)</w:t>
             </w:r>
           </w:p>
         </w:tc>
@@ -4516,7 +4883,7 @@
                 <w:color w:val="1E293B"/>
                 <w:sz w:val="18"/>
               </w:rPr>
-              <w:t>0.27</w:t>
+              <w:t>0,27 (27%)</w:t>
             </w:r>
           </w:p>
         </w:tc>
@@ -4540,7 +4907,7 @@
                 <w:color w:val="1E293B"/>
                 <w:sz w:val="18"/>
               </w:rPr>
-              <w:t>0.36</w:t>
+              <w:t>0,36 (36%)</w:t>
             </w:r>
           </w:p>
         </w:tc>
@@ -4564,7 +4931,7 @@
                 <w:color w:val="1E293B"/>
                 <w:sz w:val="18"/>
               </w:rPr>
-              <w:t>0.31</w:t>
+              <w:t>0,31</w:t>
             </w:r>
           </w:p>
         </w:tc>
@@ -4588,7 +4955,7 @@
                 <w:color w:val="1E293B"/>
                 <w:sz w:val="18"/>
               </w:rPr>
-              <w:t>4.479</w:t>
+              <w:t>4.479 temas</w:t>
             </w:r>
           </w:p>
         </w:tc>
@@ -4636,7 +5003,7 @@
                 <w:color w:val="1E293B"/>
                 <w:sz w:val="18"/>
               </w:rPr>
-              <w:t>0.62</w:t>
+              <w:t>0,62 (62%)</w:t>
             </w:r>
           </w:p>
         </w:tc>
@@ -4659,7 +5026,7 @@
                 <w:color w:val="1E293B"/>
                 <w:sz w:val="18"/>
               </w:rPr>
-              <w:t>0.58</w:t>
+              <w:t>0,58 (58%)</w:t>
             </w:r>
           </w:p>
         </w:tc>
@@ -4682,7 +5049,7 @@
                 <w:color w:val="1E293B"/>
                 <w:sz w:val="18"/>
               </w:rPr>
-              <w:t>0.60</w:t>
+              <w:t>0,60 (60%)</w:t>
             </w:r>
           </w:p>
         </w:tc>
@@ -4705,7 +5072,7 @@
                 <w:color w:val="1E293B"/>
                 <w:sz w:val="18"/>
               </w:rPr>
-              <w:t>17.000</w:t>
+              <w:t>17.000 temas</w:t>
             </w:r>
           </w:p>
         </w:tc>
@@ -4788,70 +5155,85 @@
     <w:p>
       <w:pPr>
         <w:pStyle w:val="ListBullet"/>
-        <w:spacing w:before="20" w:after="40"/>
+        <w:spacing w:before="30" w:after="50"/>
       </w:pPr>
       <w:r>
         <w:rPr>
           <w:color w:val="1E293B"/>
           <w:sz w:val="20"/>
         </w:rPr>
-        <w:t>La precisión para la clase de no éxito es sólida (74\%), lo cual permite descartar proyectos de baja probabilidad de impacto comercial con confianza.</w:t>
+        <w:t>La precisión para la clase de temas estándar es sólida (</w:t>
+      </w:r>
+      <w:r>
+        <w:rPr>
+          <w:b/>
+          <w:color w:val="0F172A"/>
+          <w:sz w:val="20"/>
+        </w:rPr>
+        <w:t>74%</w:t>
+      </w:r>
+      <w:r>
+        <w:rPr>
+          <w:color w:val="1E293B"/>
+          <w:sz w:val="20"/>
+        </w:rPr>
+        <w:t>), lo cual permite a las disqueras descartar maquetas de bajo potencial comercial con alta confianza.</w:t>
       </w:r>
     </w:p>
     <w:p>
       <w:pPr>
         <w:pStyle w:val="ListBullet"/>
-        <w:spacing w:before="20" w:after="40"/>
+        <w:spacing w:before="30" w:after="50"/>
       </w:pPr>
       <w:r>
         <w:rPr>
           <w:color w:val="1E293B"/>
           <w:sz w:val="20"/>
         </w:rPr>
-        <w:t xml:space="preserve">La predicción del éxito exclusivo mediante atributos intrínsecos de audio (tempo, danceability, energy, etc.) tiene un techo analítico natural bien documentado en la literatura científica: </w:t>
+        <w:t xml:space="preserve">La predicción del éxito exclusivamente a partir de atributos intrínsecos de audio (Tempo, Bailabilidad, Energía, Sonoridad, etc.) tiene un límite analítico natural ampliamente respaldado en la literatura científica: </w:t>
       </w:r>
       <w:r>
         <w:rPr>
           <w:b/>
+          <w:color w:val="0F172A"/>
+          <w:sz w:val="20"/>
+        </w:rPr>
+        <w:t>el éxito en la música es un fenómeno multifactorial</w:t>
+      </w:r>
+      <w:r>
+        <w:rPr>
           <w:color w:val="1E293B"/>
           <w:sz w:val="20"/>
         </w:rPr>
-        <w:t>el éxito musical es un fenómeno social complejo</w:t>
-      </w:r>
-      <w:r>
-        <w:rPr>
-          <w:color w:val="1E293B"/>
-          <w:sz w:val="20"/>
-        </w:rPr>
-        <w:t>. Dos canciones con idéntica estructura espectral pueden tener destinos diametralmente opuestos dependiendo del presupuesto de marketing de la disquera, la tracción en redes sociales (TikTok/Instagram) y la reputación previa del artista.</w:t>
+        <w:t>. Dos temas con idéntica calidad acústica pueden tener desempeños opuestos dependiendo de la inversión publicitaria en redes sociales (TikTok/Instagram), la colocación en listas de reproducción editoriales y la base previa de seguidores del artista.</w:t>
       </w:r>
     </w:p>
     <w:p>
       <w:pPr>
         <w:pStyle w:val="ListBullet"/>
-        <w:spacing w:before="20" w:after="40"/>
+        <w:spacing w:before="30" w:after="50"/>
       </w:pPr>
       <w:r>
         <w:rPr>
           <w:color w:val="1E293B"/>
           <w:sz w:val="20"/>
         </w:rPr>
-        <w:t xml:space="preserve">Por ello, el valor del sistema no radica en una certeza infalible aislada, sino en </w:t>
+        <w:t xml:space="preserve">Por tanto, el valor práctico del sistema reside en operar como un </w:t>
       </w:r>
       <w:r>
         <w:rPr>
           <w:b/>
+          <w:color w:val="0F172A"/>
+          <w:sz w:val="20"/>
+        </w:rPr>
+        <w:t>filtro inteligente de preselección (screening)</w:t>
+      </w:r>
+      <w:r>
+        <w:rPr>
           <w:color w:val="1E293B"/>
           <w:sz w:val="20"/>
         </w:rPr>
-        <w:t>operar como filtro inicial de precalificación de repertorio (screening)</w:t>
-      </w:r>
-      <w:r>
-        <w:rPr>
-          <w:color w:val="1E293B"/>
-          <w:sz w:val="20"/>
-        </w:rPr>
-        <w:t>.</w:t>
+        <w:t xml:space="preserve"> para priorizar el catálogo.</w:t>
       </w:r>
     </w:p>
     <w:p>
@@ -4886,14 +5268,14 @@
           <w:color w:val="1E293B"/>
           <w:sz w:val="20"/>
         </w:rPr>
-        <w:t>Ausencia de Señales Externas:</w:t>
+        <w:t>Ausencia de Variables de Mercado:</w:t>
       </w:r>
       <w:r>
         <w:rPr>
           <w:color w:val="1E293B"/>
           <w:sz w:val="20"/>
         </w:rPr>
-        <w:t xml:space="preserve"> El dataset no cuenta con variables dinámicas de tendencias en redes sociales o inversión publicitaria en dólares.</w:t>
+        <w:t xml:space="preserve"> El dataset no cuenta con variables de presupuesto publicitario o métricas de reproducción en redes sociales.</w:t>
       </w:r>
     </w:p>
     <w:p>
@@ -4920,7 +5302,7 @@
           <w:color w:val="1E293B"/>
           <w:sz w:val="20"/>
         </w:rPr>
-        <w:t xml:space="preserve"> La rúbrica prohíbe el uso de ensamble avanzado (Random Forest, Gradient Boosting o Deep Learning) para garantizar el dominio de los fundamentos analíticos.</w:t>
+        <w:t xml:space="preserve"> La rúbrica prohíbe el uso de algoritmos de ensamble complejo (Random Forest, Gradient Boosting o Redes Neuronales) para asegurar la comprensión de los fundamentos analíticos.</w:t>
       </w:r>
     </w:p>
     <w:p>
@@ -4977,7 +5359,22 @@
           <w:color w:val="1E293B"/>
           <w:sz w:val="20"/>
         </w:rPr>
-        <w:t xml:space="preserve"> Las reglas de asociación de Apriori demostraron que el género Pop con buen volumen de tracción inicial tiene un multiplicador de Lift = 3.40 hacia la alta popularidad.</w:t>
+        <w:t xml:space="preserve"> Las reglas de asociación de Apriori demostraron que el género Pop con buen volumen de tracción inicial tiene un multiplicador de </w:t>
+      </w:r>
+      <w:r>
+        <w:rPr>
+          <w:b/>
+          <w:color w:val="1E293B"/>
+          <w:sz w:val="20"/>
+        </w:rPr>
+        <w:t>Lift = 3,40</w:t>
+      </w:r>
+      <w:r>
+        <w:rPr>
+          <w:color w:val="1E293B"/>
+          <w:sz w:val="20"/>
+        </w:rPr>
+        <w:t xml:space="preserve"> hacia la alta popularidad.</w:t>
       </w:r>
     </w:p>
     <w:p>
@@ -5025,7 +5422,7 @@
     <w:p>
       <w:pPr>
         <w:pStyle w:val="ListBullet"/>
-        <w:spacing w:before="20" w:after="40"/>
+        <w:spacing w:before="30" w:after="50"/>
       </w:pPr>
       <w:r>
         <w:rPr>
@@ -5036,23 +5433,23 @@
       <w:r>
         <w:rPr>
           <w:b/>
+          <w:color w:val="0F172A"/>
+          <w:sz w:val="20"/>
+        </w:rPr>
+        <w:t>Estrategia para el Clúster 1 (Pop Comercial):</w:t>
+      </w:r>
+      <w:r>
+        <w:rPr>
           <w:color w:val="1E293B"/>
           <w:sz w:val="20"/>
         </w:rPr>
-        <w:t>Estrategia para el Clúster 1 (Pop Comercial):</w:t>
-      </w:r>
-      <w:r>
-        <w:rPr>
-          <w:color w:val="1E293B"/>
-          <w:sz w:val="20"/>
-        </w:rPr>
-        <w:t xml:space="preserve"> Se recomienda concentrar los presupuestos de inversión de pauta publicitaria en este segmento, garantizando que el diseño de producción mantenga niveles de danceability superiores a 0.65 y energy entre 0.60 y 0.75, maximizando la probabilidad de ingreso al Top 25%.</w:t>
+        <w:t xml:space="preserve"> Se recomienda concentrar los presupuestos de inversión de pauta publicitaria en este segmento, garantizando que el diseño de producción mantenga niveles de Bailabilidad superiores a 0,65 y Energía entre 0,60 y 0,75, maximizando la probabilidad de ingreso al Top 25%.</w:t>
       </w:r>
     </w:p>
     <w:p>
       <w:pPr>
         <w:pStyle w:val="ListBullet"/>
-        <w:spacing w:before="20" w:after="40"/>
+        <w:spacing w:before="30" w:after="50"/>
       </w:pPr>
       <w:r>
         <w:rPr>
@@ -5063,23 +5460,38 @@
       <w:r>
         <w:rPr>
           <w:b/>
+          <w:color w:val="0F172A"/>
+          <w:sz w:val="20"/>
+        </w:rPr>
+        <w:t>Estrategia para el Clúster 0 (Acústico / Chill):</w:t>
+      </w:r>
+      <w:r>
+        <w:rPr>
           <w:color w:val="1E293B"/>
           <w:sz w:val="20"/>
         </w:rPr>
-        <w:t>Estrategia para el Clúster 0 (Acústico / Chill):</w:t>
+        <w:t xml:space="preserve"> No invertir en campañas masivas de radio ni en videoclips costosos; en su lugar, negociar colocaciones editoriales en playlists funcionales de estudio y sueño ("Lo-Fi Beats", "Peaceful Piano"), donde el valor de permanencia de escucha (</w:t>
+      </w:r>
+      <w:r>
+        <w:rPr>
+          <w:i/>
+          <w:color w:val="475569"/>
+          <w:sz w:val="19"/>
+        </w:rPr>
+        <w:t>retention rate</w:t>
       </w:r>
       <w:r>
         <w:rPr>
           <w:color w:val="1E293B"/>
           <w:sz w:val="20"/>
         </w:rPr>
-        <w:t xml:space="preserve"> No invertir en campañas masivas de radio ni en videoclips costosos; en su lugar, negociar colocaciones editoriales en playlists funcionales de estudio y sueño ("Lo-Fi Beats", "Peaceful Piano"), donde el valor de permanencia de escucha (*retention rate*) es más alto.</w:t>
+        <w:t>) es más alto.</w:t>
       </w:r>
     </w:p>
     <w:p>
       <w:pPr>
         <w:pStyle w:val="ListBullet"/>
-        <w:spacing w:before="20" w:after="40"/>
+        <w:spacing w:before="30" w:after="50"/>
       </w:pPr>
       <w:r>
         <w:rPr>
@@ -5090,7 +5502,7 @@
       <w:r>
         <w:rPr>
           <w:b/>
-          <w:color w:val="1E293B"/>
+          <w:color w:val="0F172A"/>
           <w:sz w:val="20"/>
         </w:rPr>
         <w:t>Estrategia para el Clúster 3 (Urbano Explícito):</w:t>
@@ -5121,7 +5533,7 @@
     <w:p>
       <w:pPr>
         <w:pStyle w:val="ListBullet"/>
-        <w:spacing w:before="20" w:after="40"/>
+        <w:spacing w:before="30" w:after="50"/>
       </w:pPr>
       <w:r>
         <w:rPr>
@@ -5134,20 +5546,35 @@
     <w:p>
       <w:pPr>
         <w:pStyle w:val="ListBullet"/>
-        <w:spacing w:before="20" w:after="40"/>
+        <w:spacing w:before="30" w:after="50"/>
       </w:pPr>
       <w:r>
         <w:rPr>
           <w:color w:val="1E293B"/>
           <w:sz w:val="20"/>
         </w:rPr>
-        <w:t>Implementar análisis de series de tiempo para evaluar la degradación de reproducciones semanales (*decay curve*).</w:t>
+        <w:t>Implementar análisis de series de tiempo para evaluar la degradación de reproducciones semanales (</w:t>
+      </w:r>
+      <w:r>
+        <w:rPr>
+          <w:i/>
+          <w:color w:val="475569"/>
+          <w:sz w:val="19"/>
+        </w:rPr>
+        <w:t>decay curve</w:t>
+      </w:r>
+      <w:r>
+        <w:rPr>
+          <w:color w:val="1E293B"/>
+          <w:sz w:val="20"/>
+        </w:rPr>
+        <w:t>).</w:t>
       </w:r>
     </w:p>
     <w:p>
       <w:pPr>
         <w:pStyle w:val="ListBullet"/>
-        <w:spacing w:before="20" w:after="40"/>
+        <w:spacing w:before="30" w:after="50"/>
       </w:pPr>
       <w:r>
         <w:rPr>
@@ -5217,7 +5644,7 @@
     <w:p>
       <w:pPr>
         <w:pStyle w:val="ListBullet"/>
-        <w:spacing w:before="20" w:after="40"/>
+        <w:spacing w:before="30" w:after="50"/>
       </w:pPr>
       <w:r>
         <w:rPr>
@@ -5230,7 +5657,7 @@
     <w:p>
       <w:pPr>
         <w:pStyle w:val="ListBullet"/>
-        <w:spacing w:before="20" w:after="40"/>
+        <w:spacing w:before="30" w:after="50"/>
       </w:pPr>
       <w:r>
         <w:rPr>
@@ -5243,7 +5670,7 @@
     <w:p>
       <w:pPr>
         <w:pStyle w:val="ListBullet"/>
-        <w:spacing w:before="20" w:after="40"/>
+        <w:spacing w:before="30" w:after="50"/>
       </w:pPr>
       <w:r>
         <w:rPr>
@@ -5256,7 +5683,7 @@
     <w:p>
       <w:pPr>
         <w:pStyle w:val="ListBullet"/>
-        <w:spacing w:before="20" w:after="40"/>
+        <w:spacing w:before="30" w:after="50"/>
       </w:pPr>
       <w:r>
         <w:rPr>
@@ -5439,6 +5866,237 @@
     </w:p>
     <w:p>
       <w:pPr>
+        <w:pStyle w:val="Heading3"/>
+        <w:keepNext/>
+        <w:spacing w:before="160" w:after="40"/>
+      </w:pPr>
+      <w:r>
+        <w:rPr>
+          <w:b/>
+          <w:color w:val="475569"/>
+          <w:sz w:val="22"/>
+        </w:rPr>
+        <w:t>Capturas de la Aplicación Final Funcionando:</w:t>
+      </w:r>
+    </w:p>
+    <w:p>
+      <w:pPr>
+        <w:spacing w:before="200" w:after="40"/>
+        <w:jc w:val="center"/>
+      </w:pPr>
+      <w:r>
+        <w:drawing>
+          <wp:inline xmlns:a="http://schemas.openxmlformats.org/drawingml/2006/main" xmlns:pic="http://schemas.openxmlformats.org/drawingml/2006/picture">
+            <wp:extent cx="5486400" cy="3086100"/>
+            <wp:docPr id="5" name="Picture 5"/>
+            <wp:cNvGraphicFramePr>
+              <a:graphicFrameLocks noChangeAspect="1"/>
+            </wp:cNvGraphicFramePr>
+            <a:graphic>
+              <a:graphicData uri="http://schemas.openxmlformats.org/drawingml/2006/picture">
+                <pic:pic>
+                  <pic:nvPicPr>
+                    <pic:cNvPr id="0" name="app_vista_1_analisis_oyentes.png"/>
+                    <pic:cNvPicPr/>
+                  </pic:nvPicPr>
+                  <pic:blipFill>
+                    <a:blip r:embed="rId13"/>
+                    <a:stretch>
+                      <a:fillRect/>
+                    </a:stretch>
+                  </pic:blipFill>
+                  <pic:spPr>
+                    <a:xfrm>
+                      <a:off x="0" y="0"/>
+                      <a:ext cx="5486400" cy="3086100"/>
+                    </a:xfrm>
+                    <a:prstGeom prst="rect"/>
+                  </pic:spPr>
+                </pic:pic>
+              </a:graphicData>
+            </a:graphic>
+          </wp:inline>
+        </w:drawing>
+      </w:r>
+    </w:p>
+    <w:p>
+      <w:pPr>
+        <w:spacing w:before="40" w:after="240"/>
+        <w:jc w:val="center"/>
+      </w:pPr>
+      <w:r>
+        <w:rPr>
+          <w:i/>
+          <w:color w:val="475569"/>
+          <w:sz w:val="17"/>
+        </w:rPr>
+        <w:t>Figura 6: Vista 1 - Dashboard y Análisis Global de Oyentes</w:t>
+      </w:r>
+    </w:p>
+    <w:p>
+      <w:pPr>
+        <w:spacing w:before="200" w:after="40"/>
+        <w:jc w:val="center"/>
+      </w:pPr>
+      <w:r>
+        <w:drawing>
+          <wp:inline xmlns:a="http://schemas.openxmlformats.org/drawingml/2006/main" xmlns:pic="http://schemas.openxmlformats.org/drawingml/2006/picture">
+            <wp:extent cx="5486400" cy="3086100"/>
+            <wp:docPr id="6" name="Picture 6"/>
+            <wp:cNvGraphicFramePr>
+              <a:graphicFrameLocks noChangeAspect="1"/>
+            </wp:cNvGraphicFramePr>
+            <a:graphic>
+              <a:graphicData uri="http://schemas.openxmlformats.org/drawingml/2006/picture">
+                <pic:pic>
+                  <pic:nvPicPr>
+                    <pic:cNvPr id="0" name="app_vista_2_segmentacion_atributo.png"/>
+                    <pic:cNvPicPr/>
+                  </pic:nvPicPr>
+                  <pic:blipFill>
+                    <a:blip r:embed="rId14"/>
+                    <a:stretch>
+                      <a:fillRect/>
+                    </a:stretch>
+                  </pic:blipFill>
+                  <pic:spPr>
+                    <a:xfrm>
+                      <a:off x="0" y="0"/>
+                      <a:ext cx="5486400" cy="3086100"/>
+                    </a:xfrm>
+                    <a:prstGeom prst="rect"/>
+                  </pic:spPr>
+                </pic:pic>
+              </a:graphicData>
+            </a:graphic>
+          </wp:inline>
+        </w:drawing>
+      </w:r>
+    </w:p>
+    <w:p>
+      <w:pPr>
+        <w:spacing w:before="40" w:after="240"/>
+        <w:jc w:val="center"/>
+      </w:pPr>
+      <w:r>
+        <w:rPr>
+          <w:i/>
+          <w:color w:val="475569"/>
+          <w:sz w:val="17"/>
+        </w:rPr>
+        <w:t>Figura 7: Vista 2 - Segmentación Univariada por Atributo Individual</w:t>
+      </w:r>
+    </w:p>
+    <w:p>
+      <w:pPr>
+        <w:spacing w:before="200" w:after="40"/>
+        <w:jc w:val="center"/>
+      </w:pPr>
+      <w:r>
+        <w:drawing>
+          <wp:inline xmlns:a="http://schemas.openxmlformats.org/drawingml/2006/main" xmlns:pic="http://schemas.openxmlformats.org/drawingml/2006/picture">
+            <wp:extent cx="5486400" cy="3086100"/>
+            <wp:docPr id="7" name="Picture 7"/>
+            <wp:cNvGraphicFramePr>
+              <a:graphicFrameLocks noChangeAspect="1"/>
+            </wp:cNvGraphicFramePr>
+            <a:graphic>
+              <a:graphicData uri="http://schemas.openxmlformats.org/drawingml/2006/picture">
+                <pic:pic>
+                  <pic:nvPicPr>
+                    <pic:cNvPr id="0" name="app_vista_3_simulador_ml.png"/>
+                    <pic:cNvPicPr/>
+                  </pic:nvPicPr>
+                  <pic:blipFill>
+                    <a:blip r:embed="rId15"/>
+                    <a:stretch>
+                      <a:fillRect/>
+                    </a:stretch>
+                  </pic:blipFill>
+                  <pic:spPr>
+                    <a:xfrm>
+                      <a:off x="0" y="0"/>
+                      <a:ext cx="5486400" cy="3086100"/>
+                    </a:xfrm>
+                    <a:prstGeom prst="rect"/>
+                  </pic:spPr>
+                </pic:pic>
+              </a:graphicData>
+            </a:graphic>
+          </wp:inline>
+        </w:drawing>
+      </w:r>
+    </w:p>
+    <w:p>
+      <w:pPr>
+        <w:spacing w:before="40" w:after="240"/>
+        <w:jc w:val="center"/>
+      </w:pPr>
+      <w:r>
+        <w:rPr>
+          <w:i/>
+          <w:color w:val="475569"/>
+          <w:sz w:val="17"/>
+        </w:rPr>
+        <w:t>Figura 8: Vista 3 - Simulador de Éxito en Tiempo Real con Inferencia ML</w:t>
+      </w:r>
+    </w:p>
+    <w:p>
+      <w:pPr>
+        <w:spacing w:before="200" w:after="40"/>
+        <w:jc w:val="center"/>
+      </w:pPr>
+      <w:r>
+        <w:drawing>
+          <wp:inline xmlns:a="http://schemas.openxmlformats.org/drawingml/2006/main" xmlns:pic="http://schemas.openxmlformats.org/drawingml/2006/picture">
+            <wp:extent cx="5486400" cy="3086100"/>
+            <wp:docPr id="8" name="Picture 8"/>
+            <wp:cNvGraphicFramePr>
+              <a:graphicFrameLocks noChangeAspect="1"/>
+            </wp:cNvGraphicFramePr>
+            <a:graphic>
+              <a:graphicData uri="http://schemas.openxmlformats.org/drawingml/2006/picture">
+                <pic:pic>
+                  <pic:nvPicPr>
+                    <pic:cNvPr id="0" name="app_vista_4_portafolio_crud.png"/>
+                    <pic:cNvPicPr/>
+                  </pic:nvPicPr>
+                  <pic:blipFill>
+                    <a:blip r:embed="rId16"/>
+                    <a:stretch>
+                      <a:fillRect/>
+                    </a:stretch>
+                  </pic:blipFill>
+                  <pic:spPr>
+                    <a:xfrm>
+                      <a:off x="0" y="0"/>
+                      <a:ext cx="5486400" cy="3086100"/>
+                    </a:xfrm>
+                    <a:prstGeom prst="rect"/>
+                  </pic:spPr>
+                </pic:pic>
+              </a:graphicData>
+            </a:graphic>
+          </wp:inline>
+        </w:drawing>
+      </w:r>
+    </w:p>
+    <w:p>
+      <w:pPr>
+        <w:spacing w:before="40" w:after="240"/>
+        <w:jc w:val="center"/>
+      </w:pPr>
+      <w:r>
+        <w:rPr>
+          <w:i/>
+          <w:color w:val="475569"/>
+          <w:sz w:val="17"/>
+        </w:rPr>
+        <w:t>Figura 9: Vista 4 - Portafolio de Canciones y Administración CRUD en SQLite</w:t>
+      </w:r>
+    </w:p>
+    <w:p>
+      <w:pPr>
         <w:pStyle w:val="Heading2"/>
         <w:keepNext/>
         <w:spacing w:before="240" w:after="80"/>
@@ -5473,7 +6131,7 @@
         <w:drawing>
           <wp:inline xmlns:a="http://schemas.openxmlformats.org/drawingml/2006/main" xmlns:pic="http://schemas.openxmlformats.org/drawingml/2006/picture">
             <wp:extent cx="5486400" cy="2743200"/>
-            <wp:docPr id="5" name="Picture 5"/>
+            <wp:docPr id="9" name="Picture 9"/>
             <wp:cNvGraphicFramePr>
               <a:graphicFrameLocks noChangeAspect="1"/>
             </wp:cNvGraphicFramePr>
@@ -5485,7 +6143,7 @@
                     <pic:cNvPicPr/>
                   </pic:nvPicPr>
                   <pic:blipFill>
-                    <a:blip r:embed="rId13"/>
+                    <a:blip r:embed="rId17"/>
                     <a:stretch>
                       <a:fillRect/>
                     </a:stretch>
@@ -5591,7 +6249,7 @@
     <w:p>
       <w:pPr>
         <w:pStyle w:val="ListBullet"/>
-        <w:spacing w:before="20" w:after="40"/>
+        <w:spacing w:before="30" w:after="50"/>
       </w:pPr>
       <w:r>
         <w:rPr>
@@ -5602,22 +6260,22 @@
       <w:r>
         <w:rPr>
           <w:b/>
+          <w:color w:val="0F172A"/>
+          <w:sz w:val="20"/>
+        </w:rPr>
+        <w:t>Backend:</w:t>
+      </w:r>
+      <w:r>
+        <w:rPr>
           <w:color w:val="1E293B"/>
           <w:sz w:val="20"/>
         </w:rPr>
-        <w:t>Backend:</w:t>
-      </w:r>
-      <w:r>
-        <w:rPr>
-          <w:color w:val="1E293B"/>
-          <w:sz w:val="20"/>
-        </w:rPr>
         <w:t xml:space="preserve"> </w:t>
       </w:r>
       <w:r>
         <w:rPr>
           <w:b/>
-          <w:color w:val="1E293B"/>
+          <w:color w:val="0F172A"/>
           <w:sz w:val="20"/>
         </w:rPr>
         <w:t>FastAPI (Python 3.12)</w:t>
@@ -5645,7 +6303,7 @@
     <w:p>
       <w:pPr>
         <w:pStyle w:val="ListBullet"/>
-        <w:spacing w:before="20" w:after="40"/>
+        <w:spacing w:before="30" w:after="50"/>
       </w:pPr>
       <w:r>
         <w:rPr>
@@ -5656,37 +6314,37 @@
       <w:r>
         <w:rPr>
           <w:b/>
+          <w:color w:val="0F172A"/>
+          <w:sz w:val="20"/>
+        </w:rPr>
+        <w:t>Frontend:</w:t>
+      </w:r>
+      <w:r>
+        <w:rPr>
           <w:color w:val="1E293B"/>
           <w:sz w:val="20"/>
         </w:rPr>
-        <w:t>Frontend:</w:t>
+        <w:t xml:space="preserve"> </w:t>
+      </w:r>
+      <w:r>
+        <w:rPr>
+          <w:b/>
+          <w:color w:val="0F172A"/>
+          <w:sz w:val="20"/>
+        </w:rPr>
+        <w:t>HTML5, JavaScript Nativo (ES6+) y Bootstrap 5 (Dark Mode)</w:t>
       </w:r>
       <w:r>
         <w:rPr>
           <w:color w:val="1E293B"/>
           <w:sz w:val="20"/>
         </w:rPr>
-        <w:t xml:space="preserve"> </w:t>
+        <w:t xml:space="preserve">, complementado con </w:t>
       </w:r>
       <w:r>
         <w:rPr>
           <w:b/>
-          <w:color w:val="1E293B"/>
-          <w:sz w:val="20"/>
-        </w:rPr>
-        <w:t>HTML5, JavaScript Nativo (ES6+) y Bootstrap 5 (Dark Mode)</w:t>
-      </w:r>
-      <w:r>
-        <w:rPr>
-          <w:color w:val="1E293B"/>
-          <w:sz w:val="20"/>
-        </w:rPr>
-        <w:t xml:space="preserve">, complementado con </w:t>
-      </w:r>
-      <w:r>
-        <w:rPr>
-          <w:b/>
-          <w:color w:val="1E293B"/>
+          <w:color w:val="0F172A"/>
           <w:sz w:val="20"/>
         </w:rPr>
         <w:t>Chart.js</w:t>
@@ -5714,7 +6372,7 @@
     <w:p>
       <w:pPr>
         <w:pStyle w:val="ListBullet"/>
-        <w:spacing w:before="20" w:after="40"/>
+        <w:spacing w:before="30" w:after="50"/>
       </w:pPr>
       <w:r>
         <w:rPr>
@@ -5725,22 +6383,22 @@
       <w:r>
         <w:rPr>
           <w:b/>
+          <w:color w:val="0F172A"/>
+          <w:sz w:val="20"/>
+        </w:rPr>
+        <w:t>Persistencia:</w:t>
+      </w:r>
+      <w:r>
+        <w:rPr>
           <w:color w:val="1E293B"/>
           <w:sz w:val="20"/>
         </w:rPr>
-        <w:t>Persistencia:</w:t>
-      </w:r>
-      <w:r>
-        <w:rPr>
-          <w:color w:val="1E293B"/>
-          <w:sz w:val="20"/>
-        </w:rPr>
         <w:t xml:space="preserve"> </w:t>
       </w:r>
       <w:r>
         <w:rPr>
           <w:b/>
-          <w:color w:val="1E293B"/>
+          <w:color w:val="0F172A"/>
           <w:sz w:val="20"/>
         </w:rPr>
         <w:t>SQLite 3 (`sounddata.db`)</w:t>
@@ -5960,7 +6618,7 @@
     <w:p>
       <w:pPr>
         <w:pStyle w:val="ListBullet"/>
-        <w:spacing w:before="20" w:after="40"/>
+        <w:spacing w:before="30" w:after="50"/>
       </w:pPr>
       <w:r>
         <w:rPr>
@@ -5973,7 +6631,7 @@
     <w:p>
       <w:pPr>
         <w:pStyle w:val="ListBullet"/>
-        <w:spacing w:before="20" w:after="40"/>
+        <w:spacing w:before="30" w:after="50"/>
       </w:pPr>
       <w:r>
         <w:rPr>
@@ -5986,7 +6644,7 @@
     <w:p>
       <w:pPr>
         <w:pStyle w:val="ListBullet"/>
-        <w:spacing w:before="20" w:after="40"/>
+        <w:spacing w:before="30" w:after="50"/>
       </w:pPr>
       <w:r>
         <w:rPr>
@@ -6096,7 +6754,7 @@
     <w:p>
       <w:pPr>
         <w:pStyle w:val="ListBullet"/>
-        <w:spacing w:before="20" w:after="40"/>
+        <w:spacing w:before="30" w:after="50"/>
       </w:pPr>
       <w:r>
         <w:rPr>
@@ -6107,7 +6765,7 @@
       <w:r>
         <w:rPr>
           <w:b/>
-          <w:color w:val="1E293B"/>
+          <w:color w:val="0F172A"/>
           <w:sz w:val="20"/>
         </w:rPr>
         <w:t>Repositorio de Código Fuente:</w:t>
@@ -6123,7 +6781,7 @@
     <w:p>
       <w:pPr>
         <w:pStyle w:val="ListBullet"/>
-        <w:spacing w:before="20" w:after="40"/>
+        <w:spacing w:before="30" w:after="50"/>
       </w:pPr>
       <w:r>
         <w:rPr>
@@ -6134,7 +6792,7 @@
       <w:r>
         <w:rPr>
           <w:b/>
-          <w:color w:val="1E293B"/>
+          <w:color w:val="0F172A"/>
           <w:sz w:val="20"/>
         </w:rPr>
         <w:t>Despliegue en la Nube:</w:t>
@@ -6150,7 +6808,7 @@
     <w:p>
       <w:pPr>
         <w:pStyle w:val="ListBullet"/>
-        <w:spacing w:before="20" w:after="40"/>
+        <w:spacing w:before="30" w:after="50"/>
       </w:pPr>
       <w:r>
         <w:rPr>
@@ -6161,7 +6819,7 @@
       <w:r>
         <w:rPr>
           <w:b/>
-          <w:color w:val="1E293B"/>
+          <w:color w:val="0F172A"/>
           <w:sz w:val="20"/>
         </w:rPr>
         <w:t>Notebook Documentado:</w:t>
@@ -6177,7 +6835,7 @@
     <w:p>
       <w:pPr>
         <w:pStyle w:val="ListBullet"/>
-        <w:spacing w:before="20" w:after="40"/>
+        <w:spacing w:before="30" w:after="50"/>
       </w:pPr>
       <w:r>
         <w:rPr>
@@ -6188,7 +6846,7 @@
       <w:r>
         <w:rPr>
           <w:b/>
-          <w:color w:val="1E293B"/>
+          <w:color w:val="0F172A"/>
           <w:sz w:val="20"/>
         </w:rPr>
         <w:t>Video de Respaldo Local (2 min):</w:t>

</xml_diff>